<commit_message>
docs: Guía 2.6 actualizada con resultados de PR-02 y PR-03
</commit_message>
<xml_diff>
--- a/docs/fase2/evidencias_grupales/VERGARA_ANDRES_2.6_GuiaEstudiante_Fase 2_Informe Final Proyecto APT.docx
+++ b/docs/fase2/evidencias_grupales/VERGARA_ANDRES_2.6_GuiaEstudiante_Fase 2_Informe Final Proyecto APT.docx
@@ -1161,7 +1161,7 @@
           <w:color w:val="262626"/>
           <w:sz w:val="21"/>
         </w:rPr>
-        <w:t>7</w:t>
+        <w:t>8</w:t>
       </w:r>
     </w:p>
     <w:p>
@@ -1223,7 +1223,7 @@
           <w:color w:val="262626"/>
           <w:sz w:val="22"/>
         </w:rPr>
-        <w:t>14</w:t>
+        <w:t>16</w:t>
       </w:r>
     </w:p>
     <w:p>
@@ -1254,7 +1254,7 @@
           <w:color w:val="262626"/>
           <w:sz w:val="22"/>
         </w:rPr>
-        <w:t>14</w:t>
+        <w:t>16</w:t>
       </w:r>
     </w:p>
     <w:p>
@@ -1285,7 +1285,7 @@
           <w:color w:val="262626"/>
           <w:sz w:val="22"/>
         </w:rPr>
-        <w:t>14</w:t>
+        <w:t>16</w:t>
       </w:r>
     </w:p>
     <w:p>
@@ -1426,7 +1426,7 @@
           <w:color w:val="262626"/>
           <w:sz w:val="22"/>
         </w:rPr>
-        <w:t xml:space="preserve">DomoVida es una plataforma IoT de monitoreo y asistencia para personas mayores que viven solas. Detecta caídas y otros eventos de riesgo y alerta al cuidador en tiempo real. El prototipo integra un simulador de 8 sensores, una API FastAPI con persistencia en Supabase/PostgreSQL, un panel React y alertas por WebSocket y notificación push (ntfy). Se aplicaron seudonimización SHA-256 y seguridad a nivel de fila (RLS), siguiendo los principios de la Ley N° 21.719, y una implementación inicial de interoperabilidad HL7 FHIR R4. El proyecto se desarrolló con Scrum individual en sprints de tres semanas. En 30 caídas simuladas, el 100 % de las alertas llegó al panel por WebSocket, con una latencia promedio de 1.577 ms en Render y de 216 ms en AWS EC2. </w:t>
+        <w:t xml:space="preserve">DomoVida es una plataforma IoT de monitoreo y asistencia para personas mayores que viven solas. Detecta caídas y otros eventos de riesgo y alerta al cuidador en tiempo real. El prototipo integra un simulador de 8 sensores, una API FastAPI con persistencia en Supabase/PostgreSQL, un panel React y alertas por WebSocket y notificación push (ntfy). Se aplicaron seudonimización SHA-256 y seguridad a nivel de fila (RLS), siguiendo los principios de la Ley N° 21.719, y una implementación inicial de interoperabilidad HL7 FHIR R4. El proyecto se desarrolló con Scrum individual en sprints de tres semanas. En 30 caídas simuladas, el 100 % de las alertas llegó al panel por WebSocket, con una latencia promedio de 1.577 ms en Render y de 216 ms en AWS EC2, y el 100 % de las notificaciones ntfy llegó al celular del cuidador (30/30). Sin conexión a internet, el modo borde con SQLite guardó y notificó en el panel local el 100 % de las caídas (10/10). </w:t>
       </w:r>
       <w:r>
         <w:rPr>
@@ -1437,7 +1437,7 @@
           <w:sz w:val="22"/>
           <w:highlight w:val="yellow"/>
         </w:rPr>
-        <w:t>Completar con los resultados del conteo de ntfy, la prueba de continuidad sin conexión y el despliegue en Oracle Cloud Santiago.</w:t>
+        <w:t>Completar con el despliegue en Oracle Cloud Santiago.</w:t>
       </w:r>
     </w:p>
     <w:p>
@@ -1469,7 +1469,7 @@
           <w:color w:val="262626"/>
           <w:sz w:val="22"/>
         </w:rPr>
-        <w:t xml:space="preserve">DomoVida is an IoT monitoring and assistance platform for older adults who live alone. It detects falls and other risk events and alerts the caregiver in real time. The prototype integrates an 8-sensor simulator, a FastAPI backend with Supabase/PostgreSQL persistence, a React dashboard, and alerts via WebSocket and push notifications (ntfy). SHA-256 pseudonymization and Row Level Security (RLS) were applied following the principles of Chilean Law No. 21,719, together with an initial HL7 FHIR R4 interoperability layer. The project followed an individual Scrum approach with three-week sprints. Across 30 simulated falls, 100% of the alerts reached the dashboard via WebSocket, with an average latency of 1,577 ms on Render and 216 ms on AWS EC2. </w:t>
+        <w:t xml:space="preserve">DomoVida is an IoT monitoring and assistance platform for older adults who live alone. It detects falls and other risk events and alerts the caregiver in real time. The prototype integrates an 8-sensor simulator, a FastAPI backend with Supabase/PostgreSQL persistence, a React dashboard, and alerts via WebSocket and push notifications (ntfy). SHA-256 pseudonymization and Row Level Security (RLS) were applied following the principles of Chilean Law No. 21,719, together with an initial HL7 FHIR R4 interoperability layer. The project followed an individual Scrum approach with three-week sprints. Across 30 simulated falls, 100% of the alerts reached the dashboard via WebSocket, with an average latency of 1,577 ms on Render and 216 ms on AWS EC2, and 100% of the ntfy notifications reached the caregiver's phone (30/30). Without internet access, the edge mode with SQLite stored and displayed on the local dashboard 100% of the falls (10/10). </w:t>
       </w:r>
       <w:r>
         <w:rPr>
@@ -1480,7 +1480,7 @@
           <w:sz w:val="22"/>
           <w:highlight w:val="yellow"/>
         </w:rPr>
-        <w:t>Add the results of the ntfy delivery count, the offline continuity test and the Oracle Cloud Santiago deployment.</w:t>
+        <w:t>Add the Oracle Cloud Santiago deployment results.</w:t>
       </w:r>
     </w:p>
     <w:p>
@@ -2249,7 +2249,7 @@
                 <w:color w:val="262626"/>
                 <w:sz w:val="21"/>
               </w:rPr>
-              <w:t xml:space="preserve">En el prototipo, una caída simulada genera una alerta que llega al panel del cuidador en 216 ms en promedio cuando el backend y la base de datos están en la misma máquina (AWS EC2), y en 1.577 ms cuando están en regiones distintas (Render y Supabase). La alerta también llega al celular mediante ntfy. Los datos se exponen como recursos HL7 FHIR, el RUT se seudonimiza y el sistema funciona sobre servicios gratuitos, con un costo menor a USD 0,10 en las pruebas en AWS. </w:t>
+              <w:t xml:space="preserve">En el prototipo, una caída simulada genera una alerta que llega al panel del cuidador en 216 ms en promedio cuando el backend y la base de datos están en la misma máquina (AWS EC2), y en 1.577 ms cuando están en regiones distintas (Render y Supabase). La alerta también llega al celular mediante ntfy: en la prueba PR-02 llegaron 30 de 30 avisos (100 %). Además, sin internet el sistema sigue registrando y mostrando las caídas en el hogar (prueba PR-03). Los datos se exponen como recursos HL7 FHIR, el RUT se seudonimiza y el sistema funciona sobre servicios gratuitos, con un costo menor a USD 0,10 en las pruebas en AWS. </w:t>
             </w:r>
             <w:r>
               <w:rPr>
@@ -2260,7 +2260,7 @@
                 <w:sz w:val="21"/>
                 <w:highlight w:val="yellow"/>
               </w:rPr>
-              <w:t>Agregar el porcentaje de entrega de ntfy y el resultado en Oracle Cloud Santiago.</w:t>
+              <w:t>Agregar el resultado en Oracle Cloud Santiago.</w:t>
             </w:r>
           </w:p>
         </w:tc>
@@ -2359,18 +2359,7 @@
                 <w:color w:val="262626"/>
                 <w:sz w:val="21"/>
               </w:rPr>
-              <w:t xml:space="preserve">• OE1. Captura y detección en el borde: simulador de 8 sensores y detección por reglas de umbral, con persistencia local en SQLite3 (Hipp, 2024). Estado: implementado en el alcance del prototipo. </w:t>
-            </w:r>
-            <w:r>
-              <w:rPr>
-                <w:rFonts w:ascii="Calibri" w:hAnsi="Calibri" w:cs="Calibri"/>
-                <w:b w:val="0"/>
-                <w:i/>
-                <w:color w:val="262626"/>
-                <w:sz w:val="21"/>
-                <w:highlight w:val="yellow"/>
-              </w:rPr>
-              <w:t>Resultado de la prueba de continuidad sin conexión.</w:t>
+              <w:t>• OE1. Captura y detección en el borde: simulador de 8 sensores y detección por reglas de umbral, con persistencia local en SQLite3 (Hipp, 2024). Estado: implementado y validado en el alcance del prototipo: sin internet, el modo borde guardó en SQLite y mostró en el panel local 10 de 10 caídas (PR-03, hito H3). La sincronización automática con la nube al volver la conexión queda como mejora planificada.</w:t>
             </w:r>
           </w:p>
           <w:p>
@@ -2415,18 +2404,7 @@
                 <w:color w:val="262626"/>
                 <w:sz w:val="21"/>
               </w:rPr>
-              <w:t xml:space="preserve">• OE3. Panel del cuidador y alertas: panel React en Vercel con 4 pestañas, mapa Leaflet, alertas por WebSocket y notificaciones ntfy, y registro de la atención de cada alerta. Estado: implementado; la evaluación de usabilidad con la Escala SUS está planificada para la Fase 3. </w:t>
-            </w:r>
-            <w:r>
-              <w:rPr>
-                <w:rFonts w:ascii="Calibri" w:hAnsi="Calibri" w:cs="Calibri"/>
-                <w:b w:val="0"/>
-                <w:i/>
-                <w:color w:val="262626"/>
-                <w:sz w:val="21"/>
-                <w:highlight w:val="yellow"/>
-              </w:rPr>
-              <w:t>Resultado del conteo de entregas de ntfy.</w:t>
+              <w:t>• OE3. Panel del cuidador y alertas: panel React en Vercel con 4 pestañas, mapa Leaflet, alertas por WebSocket y notificaciones ntfy, y registro de la atención de cada alerta. Estado: implementado; 30 de 30 notificaciones ntfy recibidas en el celular (PR-02, meta &gt; 95 %). La evaluación de usabilidad con la Escala SUS está planificada para la Fase 3.</w:t>
             </w:r>
           </w:p>
         </w:tc>
@@ -2707,7 +2685,7 @@
                 <w:color w:val="262626"/>
                 <w:sz w:val="21"/>
               </w:rPr>
-              <w:t xml:space="preserve">• Sprint 4 (Fase 2): </w:t>
+              <w:t xml:space="preserve">• Sprint 4 (Fase 2): prueba de entrega de notificaciones ntfy (PR-02, 30/30) y prueba de continuidad sin conexión en modo borde (PR-03, 10/10), además de la documentación de la Fase 2. </w:t>
             </w:r>
             <w:r>
               <w:rPr>
@@ -2718,7 +2696,7 @@
                 <w:sz w:val="21"/>
                 <w:highlight w:val="yellow"/>
               </w:rPr>
-              <w:t>autenticación de la API (PS-01), recurso FHIR Patient, conteo de entregas de ntfy, prueba de continuidad sin conexión, despliegue en Oracle Cloud Santiago y ajustes del panel.</w:t>
+              <w:t>Pendiente: autenticación de la API (PS-01), recurso FHIR Patient, despliegue en Oracle Cloud Santiago y ajustes del panel.</w:t>
             </w:r>
           </w:p>
           <w:p>
@@ -2908,22 +2886,6 @@
           </w:p>
           <w:p>
             <w:pPr>
-              <w:keepNext/>
-              <w:spacing w:after="80" w:before="80"/>
-            </w:pPr>
-            <w:r>
-              <w:rPr>
-                <w:rFonts w:ascii="Calibri" w:hAnsi="Calibri" w:cs="Calibri"/>
-                <w:b/>
-                <w:i w:val="0"/>
-                <w:color w:val="1F3864"/>
-                <w:sz w:val="22"/>
-              </w:rPr>
-              <w:t>Ajustes realizados</w:t>
-            </w:r>
-          </w:p>
-          <w:p>
-            <w:pPr>
               <w:spacing w:after="80" w:before="0"/>
               <w:ind w:left="255" w:hanging="198"/>
               <w:jc w:val="both"/>
@@ -2936,7 +2898,23 @@
                 <w:color w:val="262626"/>
                 <w:sz w:val="21"/>
               </w:rPr>
-              <w:t>• HL7 FHIR adelantado al Sprint 3, porque el backend estaba estable y la interoperabilidad es clave para integrarse con sistemas de salud.</w:t>
+              <w:t>• La prueba sin conexión mostró que el backend usa una sola base de datos a la vez: en modo borde sigue funcionando, pero no sincroniza con la nube al volver internet.</w:t>
+            </w:r>
+          </w:p>
+          <w:p>
+            <w:pPr>
+              <w:keepNext/>
+              <w:spacing w:after="80" w:before="80"/>
+            </w:pPr>
+            <w:r>
+              <w:rPr>
+                <w:rFonts w:ascii="Calibri" w:hAnsi="Calibri" w:cs="Calibri"/>
+                <w:b/>
+                <w:i w:val="0"/>
+                <w:color w:val="1F3864"/>
+                <w:sz w:val="22"/>
+              </w:rPr>
+              <w:t>Ajustes realizados</w:t>
             </w:r>
           </w:p>
           <w:p>
@@ -2953,7 +2931,7 @@
                 <w:color w:val="262626"/>
                 <w:sz w:val="21"/>
               </w:rPr>
-              <w:t>• Bitácora en Obsidian reemplazada por fichas de sprint, registro de pruebas y tablero Kanban en GitHub, más trazables para el docente.</w:t>
+              <w:t>• HL7 FHIR adelantado al Sprint 3, porque el backend estaba estable y la interoperabilidad es clave para integrarse con sistemas de salud.</w:t>
             </w:r>
           </w:p>
           <w:p>
@@ -2970,7 +2948,7 @@
                 <w:color w:val="262626"/>
                 <w:sz w:val="21"/>
               </w:rPr>
-              <w:t>• WebSocket enviado antes que ntfy, lo que redujo la latencia en un 17 %.</w:t>
+              <w:t>• Bitácora en Obsidian reemplazada por fichas de sprint, registro de pruebas y tablero Kanban en GitHub, más trazables para el docente.</w:t>
             </w:r>
           </w:p>
           <w:p>
@@ -2987,7 +2965,7 @@
                 <w:color w:val="262626"/>
                 <w:sz w:val="21"/>
               </w:rPr>
-              <w:t>• Entorno de prueba con Docker en AWS EC2 y despliegue planificado en Oracle Cloud Santiago, para acercar el servidor a los usuarios en Chile.</w:t>
+              <w:t>• WebSocket enviado antes que ntfy, lo que redujo la latencia en un 17 %.</w:t>
             </w:r>
           </w:p>
           <w:p>
@@ -3004,7 +2982,41 @@
                 <w:color w:val="262626"/>
                 <w:sz w:val="21"/>
               </w:rPr>
+              <w:t>• Entorno de prueba con Docker en AWS EC2 y despliegue planificado en Oracle Cloud Santiago, para acercar el servidor a los usuarios en Chile.</w:t>
+            </w:r>
+          </w:p>
+          <w:p>
+            <w:pPr>
+              <w:spacing w:after="80" w:before="0"/>
+              <w:ind w:left="255" w:hanging="198"/>
+              <w:jc w:val="both"/>
+            </w:pPr>
+            <w:r>
+              <w:rPr>
+                <w:rFonts w:ascii="Calibri" w:hAnsi="Calibri" w:cs="Calibri"/>
+                <w:b w:val="0"/>
+                <w:i w:val="0"/>
+                <w:color w:val="262626"/>
+                <w:sz w:val="21"/>
+              </w:rPr>
               <w:t>• Nueva práctica: verificar el despliegue después de cada git push y revisar el panel cada semana.</w:t>
+            </w:r>
+          </w:p>
+          <w:p>
+            <w:pPr>
+              <w:spacing w:after="80" w:before="0"/>
+              <w:ind w:left="255" w:hanging="198"/>
+              <w:jc w:val="both"/>
+            </w:pPr>
+            <w:r>
+              <w:rPr>
+                <w:rFonts w:ascii="Calibri" w:hAnsi="Calibri" w:cs="Calibri"/>
+                <w:b w:val="0"/>
+                <w:i w:val="0"/>
+                <w:color w:val="262626"/>
+                <w:sz w:val="21"/>
+              </w:rPr>
+              <w:t>• Mejora planificada a partir de PR-03: almacenamiento y reenvío de eventos (guardar en SQLite como pendientes y subirlos a Supabase cuando vuelva la conexión).</w:t>
             </w:r>
           </w:p>
         </w:tc>
@@ -3241,18 +3253,7 @@
                 <w:color w:val="262626"/>
                 <w:sz w:val="21"/>
               </w:rPr>
-              <w:t xml:space="preserve">• </w:t>
-            </w:r>
-            <w:r>
-              <w:rPr>
-                <w:rFonts w:ascii="Calibri" w:hAnsi="Calibri" w:cs="Calibri"/>
-                <w:b w:val="0"/>
-                <w:i/>
-                <w:color w:val="262626"/>
-                <w:sz w:val="21"/>
-                <w:highlight w:val="yellow"/>
-              </w:rPr>
-              <w:t>E11. Conteo de entregas de ntfy con 30 caídas.</w:t>
+              <w:t>• E11. Prueba PR-02: 30 de 30 notificaciones ntfy recibidas en el celular del cuidador (OE3, Figura 13).</w:t>
             </w:r>
           </w:p>
           <w:p>
@@ -3269,18 +3270,7 @@
                 <w:color w:val="262626"/>
                 <w:sz w:val="21"/>
               </w:rPr>
-              <w:t xml:space="preserve">• </w:t>
-            </w:r>
-            <w:r>
-              <w:rPr>
-                <w:rFonts w:ascii="Calibri" w:hAnsi="Calibri" w:cs="Calibri"/>
-                <w:b w:val="0"/>
-                <w:i/>
-                <w:color w:val="262626"/>
-                <w:sz w:val="21"/>
-                <w:highlight w:val="yellow"/>
-              </w:rPr>
-              <w:t>E12. Prueba de continuidad sin conexión.</w:t>
+              <w:t>• E12. Prueba PR-03: sin internet, 10 de 10 caídas guardadas en SQLite y mostradas en el panel local; el backend sigue funcionando aunque ntfy no responda (OE1, Figuras 14 y 15).</w:t>
             </w:r>
           </w:p>
           <w:p>
@@ -4397,6 +4387,177 @@
     </w:p>
     <w:p>
       <w:pPr>
+        <w:keepNext/>
+        <w:spacing w:after="40" w:before="0"/>
+        <w:jc w:val="center"/>
+      </w:pPr>
+      <w:r>
+        <w:drawing>
+          <wp:inline xmlns:a="http://schemas.openxmlformats.org/drawingml/2006/main" xmlns:pic="http://schemas.openxmlformats.org/drawingml/2006/picture">
+            <wp:extent cx="3160975" cy="3599999"/>
+            <wp:docPr id="68" name="Picture 68"/>
+            <wp:cNvGraphicFramePr>
+              <a:graphicFrameLocks noChangeAspect="1"/>
+            </wp:cNvGraphicFramePr>
+            <a:graphic>
+              <a:graphicData uri="http://schemas.openxmlformats.org/drawingml/2006/picture">
+                <pic:pic>
+                  <pic:nvPicPr>
+                    <pic:cNvPr id="0" name="PR-02_entrega_ntfy_celular_30de30.png"/>
+                    <pic:cNvPicPr/>
+                  </pic:nvPicPr>
+                  <pic:blipFill>
+                    <a:blip r:embed="rId25"/>
+                    <a:stretch>
+                      <a:fillRect/>
+                    </a:stretch>
+                  </pic:blipFill>
+                  <pic:spPr>
+                    <a:xfrm>
+                      <a:off x="0" y="0"/>
+                      <a:ext cx="3160975" cy="3599999"/>
+                    </a:xfrm>
+                    <a:prstGeom prst="rect"/>
+                  </pic:spPr>
+                </pic:pic>
+              </a:graphicData>
+            </a:graphic>
+          </wp:inline>
+        </w:drawing>
+      </w:r>
+    </w:p>
+    <w:p>
+      <w:pPr>
+        <w:spacing w:after="200" w:before="0"/>
+        <w:jc w:val="center"/>
+      </w:pPr>
+      <w:r>
+        <w:rPr>
+          <w:rFonts w:ascii="Calibri" w:hAnsi="Calibri" w:cs="Calibri"/>
+          <w:b w:val="0"/>
+          <w:i/>
+          <w:color w:val="404040"/>
+          <w:sz w:val="19"/>
+        </w:rPr>
+        <w:t>Figura 13. PR-02: los 30 avisos «CAÍDA DETECTADA» recibidos en el celular del cuidador, 03-10-2026 (E11).</w:t>
+      </w:r>
+    </w:p>
+    <w:p>
+      <w:pPr>
+        <w:keepNext/>
+        <w:spacing w:after="40" w:before="0"/>
+        <w:jc w:val="center"/>
+      </w:pPr>
+      <w:r>
+        <w:drawing>
+          <wp:inline xmlns:a="http://schemas.openxmlformats.org/drawingml/2006/main" xmlns:pic="http://schemas.openxmlformats.org/drawingml/2006/picture">
+            <wp:extent cx="3388235" cy="3600000"/>
+            <wp:docPr id="69" name="Picture 69"/>
+            <wp:cNvGraphicFramePr>
+              <a:graphicFrameLocks noChangeAspect="1"/>
+            </wp:cNvGraphicFramePr>
+            <a:graphic>
+              <a:graphicData uri="http://schemas.openxmlformats.org/drawingml/2006/picture">
+                <pic:pic>
+                  <pic:nvPicPr>
+                    <pic:cNvPr id="0" name="PR-03_panel_local_sin_internet_ntfy_offline.png"/>
+                    <pic:cNvPicPr/>
+                  </pic:nvPicPr>
+                  <pic:blipFill>
+                    <a:blip r:embed="rId26"/>
+                    <a:stretch>
+                      <a:fillRect/>
+                    </a:stretch>
+                  </pic:blipFill>
+                  <pic:spPr>
+                    <a:xfrm>
+                      <a:off x="0" y="0"/>
+                      <a:ext cx="3388235" cy="3600000"/>
+                    </a:xfrm>
+                    <a:prstGeom prst="rect"/>
+                  </pic:spPr>
+                </pic:pic>
+              </a:graphicData>
+            </a:graphic>
+          </wp:inline>
+        </w:drawing>
+      </w:r>
+    </w:p>
+    <w:p>
+      <w:pPr>
+        <w:spacing w:after="200" w:before="0"/>
+        <w:jc w:val="center"/>
+      </w:pPr>
+      <w:r>
+        <w:rPr>
+          <w:rFonts w:ascii="Calibri" w:hAnsi="Calibri" w:cs="Calibri"/>
+          <w:b w:val="0"/>
+          <w:i/>
+          <w:color w:val="404040"/>
+          <w:sz w:val="19"/>
+        </w:rPr>
+        <w:t>Figura 14. PR-03: panel local sin internet; ntfy fuera de línea y el resto del sistema operativo (E12).</w:t>
+      </w:r>
+    </w:p>
+    <w:p>
+      <w:pPr>
+        <w:keepNext/>
+        <w:spacing w:after="40" w:before="0"/>
+        <w:jc w:val="center"/>
+      </w:pPr>
+      <w:r>
+        <w:drawing>
+          <wp:inline xmlns:a="http://schemas.openxmlformats.org/drawingml/2006/main" xmlns:pic="http://schemas.openxmlformats.org/drawingml/2006/picture">
+            <wp:extent cx="3388235" cy="3600000"/>
+            <wp:docPr id="70" name="Picture 70"/>
+            <wp:cNvGraphicFramePr>
+              <a:graphicFrameLocks noChangeAspect="1"/>
+            </wp:cNvGraphicFramePr>
+            <a:graphic>
+              <a:graphicData uri="http://schemas.openxmlformats.org/drawingml/2006/picture">
+                <pic:pic>
+                  <pic:nvPicPr>
+                    <pic:cNvPr id="0" name="PR-03_backend_sin_internet_ntfy_falla_1.png"/>
+                    <pic:cNvPicPr/>
+                  </pic:nvPicPr>
+                  <pic:blipFill>
+                    <a:blip r:embed="rId27"/>
+                    <a:stretch>
+                      <a:fillRect/>
+                    </a:stretch>
+                  </pic:blipFill>
+                  <pic:spPr>
+                    <a:xfrm>
+                      <a:off x="0" y="0"/>
+                      <a:ext cx="3388235" cy="3600000"/>
+                    </a:xfrm>
+                    <a:prstGeom prst="rect"/>
+                  </pic:spPr>
+                </pic:pic>
+              </a:graphicData>
+            </a:graphic>
+          </wp:inline>
+        </w:drawing>
+      </w:r>
+    </w:p>
+    <w:p>
+      <w:pPr>
+        <w:spacing w:after="200" w:before="0"/>
+        <w:jc w:val="center"/>
+      </w:pPr>
+      <w:r>
+        <w:rPr>
+          <w:rFonts w:ascii="Calibri" w:hAnsi="Calibri" w:cs="Calibri"/>
+          <w:b w:val="0"/>
+          <w:i/>
+          <w:color w:val="404040"/>
+          <w:sz w:val="19"/>
+        </w:rPr>
+        <w:t>Figura 15. PR-03: el backend guarda cada caída (201 Created) y registra que no puede resolver ntfy.sh sin internet (E12).</w:t>
+      </w:r>
+    </w:p>
+    <w:p>
+      <w:pPr>
         <w:spacing w:after="0" w:before="0"/>
         <w:jc w:val="both"/>
       </w:pPr>
@@ -4518,7 +4679,7 @@
           <w:sz w:val="22"/>
           <w:highlight w:val="yellow"/>
         </w:rPr>
-        <w:t>Draft to be updated after the pending tests.</w:t>
+        <w:t>Draft to be updated after the Oracle Cloud deployment.</w:t>
       </w:r>
       <w:r>
         <w:rPr>
@@ -4528,7 +4689,7 @@
           <w:color w:val="262626"/>
           <w:sz w:val="22"/>
         </w:rPr>
-        <w:t xml:space="preserve"> The DomoVida prototype covers the critical flow defined in Phase 1: fall, detection, alert and caregiver response. The three specific objectives were implemented within the scope of the prototype, and the main results were measured instead of assumed.</w:t>
+        <w:t xml:space="preserve"> The DomoVida prototype covers the critical flow defined in Phase 1: fall, detection, alert and caregiver response. The three specific objectives were implemented within the scope of the prototype, and the main results were measured instead of assumed: 100% of the alerts reached the dashboard, 100% of the push notifications reached the phone, and the system kept working without internet in edge mode.</w:t>
       </w:r>
     </w:p>
     <w:p>
@@ -4560,7 +4721,7 @@
           <w:color w:val="262626"/>
           <w:sz w:val="22"/>
         </w:rPr>
-        <w:t>The next steps are to complete the pending validations, strengthen the security of the API and evaluate usability with caregivers in Phase 3.</w:t>
+        <w:t>The offline test also revealed a gap: events stored locally are not synchronized with the cloud when the connection returns. The next steps are to implement store-and-forward synchronization, strengthen the security of the API and evaluate usability with caregivers in Phase 3.</w:t>
       </w:r>
     </w:p>
     <w:p>
@@ -5030,8 +5191,8 @@
     <w:p/>
     <w:sectPr>
       <w:headerReference w:type="default" r:id="rId11"/>
-      <w:headerReference w:type="first" r:id="rId25"/>
-      <w:footerReference w:type="default" r:id="rId26"/>
+      <w:headerReference w:type="first" r:id="rId28"/>
+      <w:footerReference w:type="default" r:id="rId29"/>
       <w:pgSz w:w="11906" w:h="16838"/>
       <w:pgMar w:top="1417" w:right="1701" w:bottom="1417" w:left="1701" w:header="708" w:footer="708" w:gutter="0"/>
       <w:cols w:space="708"/>

</xml_diff>

<commit_message>
docs: informe 2.6 actualizado con PS-01, PI-05, PU-04 y ajustes del panel
</commit_message>
<xml_diff>
--- a/docs/fase2/evidencias_grupales/VERGARA_ANDRES_2.6_GuiaEstudiante_Fase 2_Informe Final Proyecto APT.docx
+++ b/docs/fase2/evidencias_grupales/VERGARA_ANDRES_2.6_GuiaEstudiante_Fase 2_Informe Final Proyecto APT.docx
@@ -1065,7 +1065,7 @@
           <w:color w:val="262626"/>
           <w:sz w:val="21"/>
         </w:rPr>
-        <w:t>5</w:t>
+        <w:t>6</w:t>
       </w:r>
     </w:p>
     <w:p>
@@ -1129,7 +1129,7 @@
           <w:color w:val="262626"/>
           <w:sz w:val="21"/>
         </w:rPr>
-        <w:t>7</w:t>
+        <w:t>8</w:t>
       </w:r>
     </w:p>
     <w:p>
@@ -1192,7 +1192,7 @@
           <w:color w:val="262626"/>
           <w:sz w:val="22"/>
         </w:rPr>
-        <w:t>9</w:t>
+        <w:t>10</w:t>
       </w:r>
     </w:p>
     <w:p>
@@ -1223,7 +1223,7 @@
           <w:color w:val="262626"/>
           <w:sz w:val="22"/>
         </w:rPr>
-        <w:t>16</w:t>
+        <w:t>18</w:t>
       </w:r>
     </w:p>
     <w:p>
@@ -1254,7 +1254,7 @@
           <w:color w:val="262626"/>
           <w:sz w:val="22"/>
         </w:rPr>
-        <w:t>16</w:t>
+        <w:t>18</w:t>
       </w:r>
     </w:p>
     <w:p>
@@ -1285,7 +1285,7 @@
           <w:color w:val="262626"/>
           <w:sz w:val="22"/>
         </w:rPr>
-        <w:t>16</w:t>
+        <w:t>18</w:t>
       </w:r>
     </w:p>
     <w:p>
@@ -1426,7 +1426,7 @@
           <w:color w:val="262626"/>
           <w:sz w:val="22"/>
         </w:rPr>
-        <w:t xml:space="preserve">DomoVida es una plataforma IoT de monitoreo y asistencia para personas mayores que viven solas. Detecta caídas y otros eventos de riesgo y alerta al cuidador en tiempo real. El prototipo integra un simulador de 8 sensores, una API FastAPI con persistencia en Supabase/PostgreSQL, un panel React y alertas por WebSocket y notificación push (ntfy). Se aplicaron seudonimización SHA-256 y seguridad a nivel de fila (RLS), siguiendo los principios de la Ley N° 21.719, y una implementación inicial de interoperabilidad HL7 FHIR R4. El proyecto se desarrolló con Scrum individual en sprints de tres semanas. En 30 caídas simuladas, el 100 % de las alertas llegó al panel por WebSocket, con una latencia promedio de 1.577 ms en Render y de 216 ms en AWS EC2, y el 100 % de las notificaciones ntfy llegó al celular del cuidador (30/30). Sin conexión a internet, el modo borde con SQLite guardó y notificó en el panel local el 100 % de las caídas (10/10). </w:t>
+        <w:t xml:space="preserve">DomoVida es una plataforma IoT de monitoreo y asistencia para personas mayores que viven solas. Detecta caídas y otros eventos de riesgo y alerta al cuidador en tiempo real. El prototipo integra un simulador de 8 sensores, una API FastAPI con persistencia en Supabase/PostgreSQL, un panel React y alertas por WebSocket y notificación push (ntfy). Se aplicaron seudonimización SHA-256, seguridad a nivel de fila (RLS) y una clave de API para los sensores, siguiendo los principios de la Ley N° 21.719, y se implementó la interoperabilidad HL7 FHIR R4 con los recursos Observation y Patient seudonimizado. El proyecto se desarrolló con Scrum individual en sprints de tres semanas. En 30 caídas simuladas, el 100 % de las alertas llegó al panel por WebSocket, con una latencia promedio de 1.577 ms en Render y de 216 ms en AWS EC2, y el 100 % de las notificaciones ntfy llegó al celular del cuidador (30/30). Sin conexión a internet, el modo borde con SQLite guardó y notificó en el panel local el 100 % de las caídas (10/10). La clave de API rechazó el 100 % de los envíos sin clave o con clave falsa en producción. </w:t>
       </w:r>
       <w:r>
         <w:rPr>
@@ -1469,7 +1469,7 @@
           <w:color w:val="262626"/>
           <w:sz w:val="22"/>
         </w:rPr>
-        <w:t xml:space="preserve">DomoVida is an IoT monitoring and assistance platform for older adults who live alone. It detects falls and other risk events and alerts the caregiver in real time. The prototype integrates an 8-sensor simulator, a FastAPI backend with Supabase/PostgreSQL persistence, a React dashboard, and alerts via WebSocket and push notifications (ntfy). SHA-256 pseudonymization and Row Level Security (RLS) were applied following the principles of Chilean Law No. 21,719, together with an initial HL7 FHIR R4 interoperability layer. The project followed an individual Scrum approach with three-week sprints. Across 30 simulated falls, 100% of the alerts reached the dashboard via WebSocket, with an average latency of 1,577 ms on Render and 216 ms on AWS EC2, and 100% of the ntfy notifications reached the caregiver's phone (30/30). Without internet access, the edge mode with SQLite stored and displayed on the local dashboard 100% of the falls (10/10). </w:t>
+        <w:t xml:space="preserve">DomoVida is an IoT monitoring and assistance platform for older adults who live alone. It detects falls and other risk events and alerts the caregiver in real time. The prototype integrates an 8-sensor simulator, a FastAPI backend with Supabase/PostgreSQL persistence, a React dashboard, and alerts via WebSocket and push notifications (ntfy). SHA-256 pseudonymization, Row Level Security (RLS) and an API key for the sensors were applied following the principles of Chilean Law No. 21,719, and HL7 FHIR R4 interoperability was implemented with the Observation and pseudonymized Patient resources. The project followed an individual Scrum approach with three-week sprints. Across 30 simulated falls, 100% of the alerts reached the dashboard via WebSocket, with an average latency of 1,577 ms on Render and 216 ms on AWS EC2, and 100% of the ntfy notifications reached the caregiver's phone (30/30). Without internet access, the edge mode with SQLite stored and displayed on the local dashboard 100% of the falls (10/10). In production, the API key rejected 100% of the requests without a key or with a wrong key. </w:t>
       </w:r>
       <w:r>
         <w:rPr>
@@ -2249,7 +2249,7 @@
                 <w:color w:val="262626"/>
                 <w:sz w:val="21"/>
               </w:rPr>
-              <w:t xml:space="preserve">En el prototipo, una caída simulada genera una alerta que llega al panel del cuidador en 216 ms en promedio cuando el backend y la base de datos están en la misma máquina (AWS EC2), y en 1.577 ms cuando están en regiones distintas (Render y Supabase). La alerta también llega al celular mediante ntfy: en la prueba PR-02 llegaron 30 de 30 avisos (100 %). Además, sin internet el sistema sigue registrando y mostrando las caídas en el hogar (prueba PR-03). Los datos se exponen como recursos HL7 FHIR, el RUT se seudonimiza y el sistema funciona sobre servicios gratuitos, con un costo menor a USD 0,10 en las pruebas en AWS. </w:t>
+              <w:t xml:space="preserve">En el prototipo, una caída simulada genera una alerta que llega al panel del cuidador en 216 ms en promedio cuando el backend y la base de datos están en la misma máquina (AWS EC2), y en 1.577 ms cuando están en regiones distintas (Render y Supabase). La alerta también llega al celular mediante ntfy: en la prueba PR-02 llegaron 30 de 30 avisos (100 %). Además, sin internet el sistema sigue registrando y mostrando las caídas en el hogar (prueba PR-03). Los datos se exponen como recursos HL7 FHIR (Observation y Patient seudonimizado), el RUT se seudonimiza, solo los sensores con la clave de API pueden enviar datos y el sistema funciona sobre servicios gratuitos, con un costo menor a USD 0,10 en las pruebas en AWS. </w:t>
             </w:r>
             <w:r>
               <w:rPr>
@@ -2376,18 +2376,7 @@
                 <w:color w:val="262626"/>
                 <w:sz w:val="21"/>
               </w:rPr>
-              <w:t xml:space="preserve">• OE2. Backend, datos y protección de datos: API REST asíncrona en FastAPI (Ramírez, 2023) con persistencia en Supabase/PostgreSQL (Supabase Inc., 2024), triggers, seudonimización, RLS y diseño compatible con HL7 FHIR R4. Estado: implementado en el alcance del prototipo, con recursos Observation y Bundle validados. </w:t>
-            </w:r>
-            <w:r>
-              <w:rPr>
-                <w:rFonts w:ascii="Calibri" w:hAnsi="Calibri" w:cs="Calibri"/>
-                <w:b w:val="0"/>
-                <w:i/>
-                <w:color w:val="262626"/>
-                <w:sz w:val="21"/>
-                <w:highlight w:val="yellow"/>
-              </w:rPr>
-              <w:t>Estado del recurso Patient y de la autenticación de la API (PS-01).</w:t>
+              <w:t>• OE2. Backend, datos y protección de datos: API REST asíncrona en FastAPI (Ramírez, 2023) con persistencia en Supabase/PostgreSQL (Supabase Inc., 2024), triggers, seudonimización, RLS y diseño compatible con HL7 FHIR R4. Estado: implementado en el alcance del prototipo. Los recursos FHIR Observation, Bundle y Patient seudonimizado (sin nombre, RUT ni dirección) son válidos según FHIR R4 (PI-04 y PI-05, 8/8). Los sensores se autentican con una clave de API (PS-01, 3/3 en producción); la autenticación del cuidador en el panel queda planificada para el Sprint 5.</w:t>
             </w:r>
           </w:p>
           <w:p>
@@ -2404,7 +2393,7 @@
                 <w:color w:val="262626"/>
                 <w:sz w:val="21"/>
               </w:rPr>
-              <w:t>• OE3. Panel del cuidador y alertas: panel React en Vercel con 4 pestañas, mapa Leaflet, alertas por WebSocket y notificaciones ntfy, y registro de la atención de cada alerta. Estado: implementado; 30 de 30 notificaciones ntfy recibidas en el celular (PR-02, meta &gt; 95 %). La evaluación de usabilidad con la Escala SUS está planificada para la Fase 3.</w:t>
+              <w:t>• OE3. Panel del cuidador y alertas: panel React en Vercel con 4 pestañas, mapa Leaflet, alertas por WebSocket y notificaciones ntfy, registro de la atención de cada alerta y regla de la puerta principal (alerta de noche o si queda abierta 10 minutos, PU-04, 10/10). Estado: implementado; el panel distingue los componentes simulados y muestra la base de datos en uso y la hora de atención de cada alerta; 30 de 30 notificaciones ntfy recibidas en el celular (PR-02, meta &gt; 95 %). La evaluación de usabilidad con la Escala SUS está planificada para la Fase 3.</w:t>
             </w:r>
           </w:p>
         </w:tc>
@@ -2685,7 +2674,7 @@
                 <w:color w:val="262626"/>
                 <w:sz w:val="21"/>
               </w:rPr>
-              <w:t xml:space="preserve">• Sprint 4 (Fase 2): prueba de entrega de notificaciones ntfy (PR-02, 30/30) y prueba de continuidad sin conexión en modo borde (PR-03, 10/10), además de la documentación de la Fase 2. </w:t>
+              <w:t xml:space="preserve">• Sprint 4 (Fase 2): prueba de entrega de notificaciones ntfy (PR-02, 30/30), prueba de continuidad sin conexión en modo borde (PR-03, 10/10), ajustes del panel (componentes simulados, base de datos en uso y alertas atendidas), regla de la puerta principal (PU-04, 10/10), clave de API para los sensores (PS-01, 3/3 en producción), recurso FHIR Patient seudonimizado (PI-05, 8/8) y documentación de la Fase 2. </w:t>
             </w:r>
             <w:r>
               <w:rPr>
@@ -2696,7 +2685,7 @@
                 <w:sz w:val="21"/>
                 <w:highlight w:val="yellow"/>
               </w:rPr>
-              <w:t>Pendiente: autenticación de la API (PS-01), recurso FHIR Patient, despliegue en Oracle Cloud Santiago y ajustes del panel.</w:t>
+              <w:t>Pendiente: despliegue en Oracle Cloud Santiago (la región no tenía capacidad para las máquinas gratuitas el 03-10 y el 05-10-2026).</w:t>
             </w:r>
           </w:p>
           <w:p>
@@ -2903,22 +2892,6 @@
           </w:p>
           <w:p>
             <w:pPr>
-              <w:keepNext/>
-              <w:spacing w:after="80" w:before="80"/>
-            </w:pPr>
-            <w:r>
-              <w:rPr>
-                <w:rFonts w:ascii="Calibri" w:hAnsi="Calibri" w:cs="Calibri"/>
-                <w:b/>
-                <w:i w:val="0"/>
-                <w:color w:val="1F3864"/>
-                <w:sz w:val="22"/>
-              </w:rPr>
-              <w:t>Ajustes realizados</w:t>
-            </w:r>
-          </w:p>
-          <w:p>
-            <w:pPr>
               <w:spacing w:after="80" w:before="0"/>
               <w:ind w:left="255" w:hanging="198"/>
               <w:jc w:val="both"/>
@@ -2931,7 +2904,7 @@
                 <w:color w:val="262626"/>
                 <w:sz w:val="21"/>
               </w:rPr>
-              <w:t>• HL7 FHIR adelantado al Sprint 3, porque el backend estaba estable y la interoperabilidad es clave para integrarse con sistemas de salud.</w:t>
+              <w:t>• La región de Oracle Cloud en Santiago no tenía capacidad para las máquinas gratuitas (A1.Flex y E2.1.Micro) en dos intentos, por lo que el despliegue en Chile quedó pendiente.</w:t>
             </w:r>
           </w:p>
           <w:p>
@@ -2948,7 +2921,23 @@
                 <w:color w:val="262626"/>
                 <w:sz w:val="21"/>
               </w:rPr>
-              <w:t>• Bitácora en Obsidian reemplazada por fichas de sprint, registro de pruebas y tablero Kanban en GitHub, más trazables para el docente.</w:t>
+              <w:t>• Al activar la clave de API, la clave guardada no coincidía con la del servidor; se diagnosticó comparando una huella SHA-256 parcial, sin exponer la clave, y se reemplazó por una nueva.</w:t>
+            </w:r>
+          </w:p>
+          <w:p>
+            <w:pPr>
+              <w:keepNext/>
+              <w:spacing w:after="80" w:before="80"/>
+            </w:pPr>
+            <w:r>
+              <w:rPr>
+                <w:rFonts w:ascii="Calibri" w:hAnsi="Calibri" w:cs="Calibri"/>
+                <w:b/>
+                <w:i w:val="0"/>
+                <w:color w:val="1F3864"/>
+                <w:sz w:val="22"/>
+              </w:rPr>
+              <w:t>Ajustes realizados</w:t>
             </w:r>
           </w:p>
           <w:p>
@@ -2965,7 +2954,7 @@
                 <w:color w:val="262626"/>
                 <w:sz w:val="21"/>
               </w:rPr>
-              <w:t>• WebSocket enviado antes que ntfy, lo que redujo la latencia en un 17 %.</w:t>
+              <w:t>• HL7 FHIR adelantado al Sprint 3, porque el backend estaba estable y la interoperabilidad es clave para integrarse con sistemas de salud.</w:t>
             </w:r>
           </w:p>
           <w:p>
@@ -2982,7 +2971,7 @@
                 <w:color w:val="262626"/>
                 <w:sz w:val="21"/>
               </w:rPr>
-              <w:t>• Entorno de prueba con Docker en AWS EC2 y despliegue planificado en Oracle Cloud Santiago, para acercar el servidor a los usuarios en Chile.</w:t>
+              <w:t>• Bitácora en Obsidian reemplazada por fichas de sprint, registro de pruebas y tablero Kanban en GitHub, más trazables para el docente.</w:t>
             </w:r>
           </w:p>
           <w:p>
@@ -2999,7 +2988,92 @@
                 <w:color w:val="262626"/>
                 <w:sz w:val="21"/>
               </w:rPr>
+              <w:t>• WebSocket enviado antes que ntfy, lo que redujo la latencia en un 17 %.</w:t>
+            </w:r>
+          </w:p>
+          <w:p>
+            <w:pPr>
+              <w:spacing w:after="80" w:before="0"/>
+              <w:ind w:left="255" w:hanging="198"/>
+              <w:jc w:val="both"/>
+            </w:pPr>
+            <w:r>
+              <w:rPr>
+                <w:rFonts w:ascii="Calibri" w:hAnsi="Calibri" w:cs="Calibri"/>
+                <w:b w:val="0"/>
+                <w:i w:val="0"/>
+                <w:color w:val="262626"/>
+                <w:sz w:val="21"/>
+              </w:rPr>
+              <w:t>• Entorno de prueba con Docker en AWS EC2 y despliegue planificado en Oracle Cloud Santiago, para acercar el servidor a los usuarios en Chile.</w:t>
+            </w:r>
+          </w:p>
+          <w:p>
+            <w:pPr>
+              <w:spacing w:after="80" w:before="0"/>
+              <w:ind w:left="255" w:hanging="198"/>
+              <w:jc w:val="both"/>
+            </w:pPr>
+            <w:r>
+              <w:rPr>
+                <w:rFonts w:ascii="Calibri" w:hAnsi="Calibri" w:cs="Calibri"/>
+                <w:b w:val="0"/>
+                <w:i w:val="0"/>
+                <w:color w:val="262626"/>
+                <w:sz w:val="21"/>
+              </w:rPr>
               <w:t>• Nueva práctica: verificar el despliegue después de cada git push y revisar el panel cada semana.</w:t>
+            </w:r>
+          </w:p>
+          <w:p>
+            <w:pPr>
+              <w:spacing w:after="80" w:before="0"/>
+              <w:ind w:left="255" w:hanging="198"/>
+              <w:jc w:val="both"/>
+            </w:pPr>
+            <w:r>
+              <w:rPr>
+                <w:rFonts w:ascii="Calibri" w:hAnsi="Calibri" w:cs="Calibri"/>
+                <w:b w:val="0"/>
+                <w:i w:val="0"/>
+                <w:color w:val="262626"/>
+                <w:sz w:val="21"/>
+              </w:rPr>
+              <w:t>• Seguridad: la revisión de PS-01 mostró que la API no tenía autenticación; se agregó una clave de API para los sensores, guardada como variable de entorno y nunca en el repositorio.</w:t>
+            </w:r>
+          </w:p>
+          <w:p>
+            <w:pPr>
+              <w:spacing w:after="80" w:before="0"/>
+              <w:ind w:left="255" w:hanging="198"/>
+              <w:jc w:val="both"/>
+            </w:pPr>
+            <w:r>
+              <w:rPr>
+                <w:rFonts w:ascii="Calibri" w:hAnsi="Calibri" w:cs="Calibri"/>
+                <w:b w:val="0"/>
+                <w:i w:val="0"/>
+                <w:color w:val="262626"/>
+                <w:sz w:val="21"/>
+              </w:rPr>
+              <w:t>• Regla de la puerta principal trasladada del simulador al backend: alerta solo si se abre de noche o si queda abierta 10 minutos o más, para reducir falsas alarmas.</w:t>
+            </w:r>
+          </w:p>
+          <w:p>
+            <w:pPr>
+              <w:spacing w:after="80" w:before="0"/>
+              <w:ind w:left="255" w:hanging="198"/>
+              <w:jc w:val="both"/>
+            </w:pPr>
+            <w:r>
+              <w:rPr>
+                <w:rFonts w:ascii="Calibri" w:hAnsi="Calibri" w:cs="Calibri"/>
+                <w:b w:val="0"/>
+                <w:i w:val="0"/>
+                <w:color w:val="262626"/>
+                <w:sz w:val="21"/>
+              </w:rPr>
+              <w:t>• Panel más honesto con el estado real: la Raspberry Pi y MQTT se muestran como simulados y la tarjeta de base de datos indica si se usa Supabase o SQLite.</w:t>
             </w:r>
           </w:p>
           <w:p>
@@ -3287,6 +3361,57 @@
                 <w:color w:val="262626"/>
                 <w:sz w:val="21"/>
               </w:rPr>
+              <w:t>• E13. Prueba PS-01: en producción, sin clave y con clave falsa el servidor responde 401 y con la clave real 201 (3/3) (OE2, Figura 16).</w:t>
+            </w:r>
+          </w:p>
+          <w:p>
+            <w:pPr>
+              <w:spacing w:after="80" w:before="0"/>
+              <w:ind w:left="255" w:hanging="198"/>
+              <w:jc w:val="both"/>
+            </w:pPr>
+            <w:r>
+              <w:rPr>
+                <w:rFonts w:ascii="Calibri" w:hAnsi="Calibri" w:cs="Calibri"/>
+                <w:b w:val="0"/>
+                <w:i w:val="0"/>
+                <w:color w:val="262626"/>
+                <w:sz w:val="21"/>
+              </w:rPr>
+              <w:t>• E14. Prueba PI-05: recurso FHIR Patient seudonimizado, válido según FHIR R4 y sin datos identificatorios (8/8) (OE2, archivo PI-05_resultado_fhir_patient.txt).</w:t>
+            </w:r>
+          </w:p>
+          <w:p>
+            <w:pPr>
+              <w:spacing w:after="80" w:before="0"/>
+              <w:ind w:left="255" w:hanging="198"/>
+              <w:jc w:val="both"/>
+            </w:pPr>
+            <w:r>
+              <w:rPr>
+                <w:rFonts w:ascii="Calibri" w:hAnsi="Calibri" w:cs="Calibri"/>
+                <w:b w:val="0"/>
+                <w:i w:val="0"/>
+                <w:color w:val="262626"/>
+                <w:sz w:val="21"/>
+              </w:rPr>
+              <w:t>• E15. Prueba PU-04: regla de la puerta principal, 10/10 casos (OE3, archivo PU-04_resultado_regla_puerta.txt) y panel con componentes simulados (Figura 17).</w:t>
+            </w:r>
+          </w:p>
+          <w:p>
+            <w:pPr>
+              <w:spacing w:after="80" w:before="0"/>
+              <w:ind w:left="255" w:hanging="198"/>
+              <w:jc w:val="both"/>
+            </w:pPr>
+            <w:r>
+              <w:rPr>
+                <w:rFonts w:ascii="Calibri" w:hAnsi="Calibri" w:cs="Calibri"/>
+                <w:b w:val="0"/>
+                <w:i w:val="0"/>
+                <w:color w:val="262626"/>
+                <w:sz w:val="21"/>
+              </w:rPr>
               <w:t xml:space="preserve">• </w:t>
             </w:r>
             <w:r>
@@ -3298,7 +3423,7 @@
                 <w:sz w:val="21"/>
                 <w:highlight w:val="yellow"/>
               </w:rPr>
-              <w:t>E13. Comparación de latencia Render, AWS EC2 y Oracle Cloud Santiago.</w:t>
+              <w:t>E16. Comparación de latencia Render, AWS EC2 y Oracle Cloud Santiago.</w:t>
             </w:r>
           </w:p>
         </w:tc>
@@ -4558,6 +4683,120 @@
     </w:p>
     <w:p>
       <w:pPr>
+        <w:keepNext/>
+        <w:spacing w:after="40" w:before="0"/>
+        <w:jc w:val="center"/>
+      </w:pPr>
+      <w:r>
+        <w:drawing>
+          <wp:inline xmlns:a="http://schemas.openxmlformats.org/drawingml/2006/main" xmlns:pic="http://schemas.openxmlformats.org/drawingml/2006/picture">
+            <wp:extent cx="3388235" cy="3600000"/>
+            <wp:docPr id="71" name="Picture 71"/>
+            <wp:cNvGraphicFramePr>
+              <a:graphicFrameLocks noChangeAspect="1"/>
+            </wp:cNvGraphicFramePr>
+            <a:graphic>
+              <a:graphicData uri="http://schemas.openxmlformats.org/drawingml/2006/picture">
+                <pic:pic>
+                  <pic:nvPicPr>
+                    <pic:cNvPr id="0" name="PS-01_produccion_3de3.png"/>
+                    <pic:cNvPicPr/>
+                  </pic:nvPicPr>
+                  <pic:blipFill>
+                    <a:blip r:embed="rId28"/>
+                    <a:stretch>
+                      <a:fillRect/>
+                    </a:stretch>
+                  </pic:blipFill>
+                  <pic:spPr>
+                    <a:xfrm>
+                      <a:off x="0" y="0"/>
+                      <a:ext cx="3388235" cy="3600000"/>
+                    </a:xfrm>
+                    <a:prstGeom prst="rect"/>
+                  </pic:spPr>
+                </pic:pic>
+              </a:graphicData>
+            </a:graphic>
+          </wp:inline>
+        </w:drawing>
+      </w:r>
+    </w:p>
+    <w:p>
+      <w:pPr>
+        <w:spacing w:after="200" w:before="0"/>
+        <w:jc w:val="center"/>
+      </w:pPr>
+      <w:r>
+        <w:rPr>
+          <w:rFonts w:ascii="Calibri" w:hAnsi="Calibri" w:cs="Calibri"/>
+          <w:b w:val="0"/>
+          <w:i/>
+          <w:color w:val="404040"/>
+          <w:sz w:val="19"/>
+        </w:rPr>
+        <w:t>Figura 16. PS-01 en producción: sin clave y con clave falsa 401, con la clave real 201; la huella de la clave coincide con la del servidor (E13).</w:t>
+      </w:r>
+    </w:p>
+    <w:p>
+      <w:pPr>
+        <w:keepNext/>
+        <w:spacing w:after="40" w:before="0"/>
+        <w:jc w:val="center"/>
+      </w:pPr>
+      <w:r>
+        <w:drawing>
+          <wp:inline xmlns:a="http://schemas.openxmlformats.org/drawingml/2006/main" xmlns:pic="http://schemas.openxmlformats.org/drawingml/2006/picture">
+            <wp:extent cx="3388235" cy="3600000"/>
+            <wp:docPr id="72" name="Picture 72"/>
+            <wp:cNvGraphicFramePr>
+              <a:graphicFrameLocks noChangeAspect="1"/>
+            </wp:cNvGraphicFramePr>
+            <a:graphic>
+              <a:graphicData uri="http://schemas.openxmlformats.org/drawingml/2006/picture">
+                <pic:pic>
+                  <pic:nvPicPr>
+                    <pic:cNvPr id="0" name="panel_estado_sistema_simulados.png"/>
+                    <pic:cNvPicPr/>
+                  </pic:nvPicPr>
+                  <pic:blipFill>
+                    <a:blip r:embed="rId29"/>
+                    <a:stretch>
+                      <a:fillRect/>
+                    </a:stretch>
+                  </pic:blipFill>
+                  <pic:spPr>
+                    <a:xfrm>
+                      <a:off x="0" y="0"/>
+                      <a:ext cx="3388235" cy="3600000"/>
+                    </a:xfrm>
+                    <a:prstGeom prst="rect"/>
+                  </pic:spPr>
+                </pic:pic>
+              </a:graphicData>
+            </a:graphic>
+          </wp:inline>
+        </w:drawing>
+      </w:r>
+    </w:p>
+    <w:p>
+      <w:pPr>
+        <w:spacing w:after="200" w:before="0"/>
+        <w:jc w:val="center"/>
+      </w:pPr>
+      <w:r>
+        <w:rPr>
+          <w:rFonts w:ascii="Calibri" w:hAnsi="Calibri" w:cs="Calibri"/>
+          <w:b w:val="0"/>
+          <w:i/>
+          <w:color w:val="404040"/>
+          <w:sz w:val="19"/>
+        </w:rPr>
+        <w:t>Figura 17. Estado del sistema en el panel: Raspberry Pi y MQTT marcados como simulados (E15).</w:t>
+      </w:r>
+    </w:p>
+    <w:p>
+      <w:pPr>
         <w:spacing w:after="0" w:before="0"/>
         <w:jc w:val="both"/>
       </w:pPr>
@@ -4721,7 +4960,7 @@
           <w:color w:val="262626"/>
           <w:sz w:val="22"/>
         </w:rPr>
-        <w:t>The offline test also revealed a gap: events stored locally are not synchronized with the cloud when the connection returns. The next steps are to implement store-and-forward synchronization, strengthen the security of the API and evaluate usability with caregivers in Phase 3.</w:t>
+        <w:t>The offline test also revealed a gap: events stored locally are not synchronized with the cloud when the connection returns. Security was strengthened with an API key for the sensors (3/3 in production), and interoperability was completed with a pseudonymized FHIR Patient resource. The next steps are to implement store-and-forward synchronization, add caregiver login to the dashboard and evaluate usability with caregivers in Phase 3.</w:t>
       </w:r>
     </w:p>
     <w:p>
@@ -5191,8 +5430,8 @@
     <w:p/>
     <w:sectPr>
       <w:headerReference w:type="default" r:id="rId11"/>
-      <w:headerReference w:type="first" r:id="rId28"/>
-      <w:footerReference w:type="default" r:id="rId29"/>
+      <w:headerReference w:type="first" r:id="rId30"/>
+      <w:footerReference w:type="default" r:id="rId31"/>
       <w:pgSz w:w="11906" w:h="16838"/>
       <w:pgMar w:top="1417" w:right="1701" w:bottom="1417" w:left="1701" w:header="708" w:footer="708" w:gutter="0"/>
       <w:cols w:space="708"/>

</xml_diff>

<commit_message>
docs: informe 2.6 con PS-01b (sesión del cuidador) y PI-03b (RLS en sensores)
</commit_message>
<xml_diff>
--- a/docs/fase2/evidencias_grupales/VERGARA_ANDRES_2.6_GuiaEstudiante_Fase 2_Informe Final Proyecto APT.docx
+++ b/docs/fase2/evidencias_grupales/VERGARA_ANDRES_2.6_GuiaEstudiante_Fase 2_Informe Final Proyecto APT.docx
@@ -1161,7 +1161,7 @@
           <w:color w:val="262626"/>
           <w:sz w:val="21"/>
         </w:rPr>
-        <w:t>8</w:t>
+        <w:t>9</w:t>
       </w:r>
     </w:p>
     <w:p>
@@ -1426,7 +1426,7 @@
           <w:color w:val="262626"/>
           <w:sz w:val="22"/>
         </w:rPr>
-        <w:t xml:space="preserve">DomoVida es una plataforma IoT de monitoreo y asistencia para personas mayores que viven solas. Detecta caídas y otros eventos de riesgo y alerta al cuidador en tiempo real. El prototipo integra un simulador de 8 sensores, una API FastAPI con persistencia en Supabase/PostgreSQL, un panel React y alertas por WebSocket y notificación push (ntfy). Se aplicaron seudonimización SHA-256, seguridad a nivel de fila (RLS) y una clave de API para los sensores, siguiendo los principios de la Ley N° 21.719, y se implementó la interoperabilidad HL7 FHIR R4 con los recursos Observation y Patient seudonimizado. El proyecto se desarrolló con Scrum individual en sprints de tres semanas. En 30 caídas simuladas, el 100 % de las alertas llegó al panel por WebSocket, con una latencia promedio de 1.577 ms en Render y de 216 ms en AWS EC2, y el 100 % de las notificaciones ntfy llegó al celular del cuidador (30/30). Sin conexión a internet, el modo borde con SQLite guardó y notificó en el panel local el 100 % de las caídas (10/10). La clave de API rechazó el 100 % de los envíos sin clave o con clave falsa en producción. </w:t>
+        <w:t xml:space="preserve">DomoVida es una plataforma IoT de monitoreo y asistencia para personas mayores que viven solas. Detecta caídas y otros eventos de riesgo y alerta al cuidador en tiempo real. El prototipo integra un simulador de 8 sensores, una API FastAPI con persistencia en Supabase/PostgreSQL, un panel React y alertas por WebSocket y notificación push (ntfy). Se aplicaron seudonimización SHA-256, seguridad a nivel de fila (RLS), una clave de API para los sensores e inicio de sesión del cuidador con Supabase Auth, siguiendo los principios de la Ley N° 21.719, y se implementó la interoperabilidad HL7 FHIR R4 con los recursos Observation y Patient seudonimizado. El proyecto se desarrolló con Scrum individual en sprints de tres semanas. En 30 caídas simuladas, el 100 % de las alertas llegó al panel por WebSocket, con una latencia promedio de 1.577 ms en Render y de 216 ms en AWS EC2, y el 100 % de las notificaciones ntfy llegó al celular del cuidador (30/30). Sin conexión a internet, el modo borde con SQLite guardó y notificó en el panel local el 100 % de las caídas (10/10). En producción, la API rechazó el 100 % de los envíos de sensores sin clave válida y de los intentos de atender una alerta sin sesión del cuidador. </w:t>
       </w:r>
       <w:r>
         <w:rPr>
@@ -1469,7 +1469,7 @@
           <w:color w:val="262626"/>
           <w:sz w:val="22"/>
         </w:rPr>
-        <w:t xml:space="preserve">DomoVida is an IoT monitoring and assistance platform for older adults who live alone. It detects falls and other risk events and alerts the caregiver in real time. The prototype integrates an 8-sensor simulator, a FastAPI backend with Supabase/PostgreSQL persistence, a React dashboard, and alerts via WebSocket and push notifications (ntfy). SHA-256 pseudonymization, Row Level Security (RLS) and an API key for the sensors were applied following the principles of Chilean Law No. 21,719, and HL7 FHIR R4 interoperability was implemented with the Observation and pseudonymized Patient resources. The project followed an individual Scrum approach with three-week sprints. Across 30 simulated falls, 100% of the alerts reached the dashboard via WebSocket, with an average latency of 1,577 ms on Render and 216 ms on AWS EC2, and 100% of the ntfy notifications reached the caregiver's phone (30/30). Without internet access, the edge mode with SQLite stored and displayed on the local dashboard 100% of the falls (10/10). In production, the API key rejected 100% of the requests without a key or with a wrong key. </w:t>
+        <w:t xml:space="preserve">DomoVida is an IoT monitoring and assistance platform for older adults who live alone. It detects falls and other risk events and alerts the caregiver in real time. The prototype integrates an 8-sensor simulator, a FastAPI backend with Supabase/PostgreSQL persistence, a React dashboard, and alerts via WebSocket and push notifications (ntfy). SHA-256 pseudonymization, Row Level Security (RLS), an API key for the sensors and caregiver login with Supabase Auth were applied following the principles of Chilean Law No. 21,719, and HL7 FHIR R4 interoperability was implemented with the Observation and pseudonymized Patient resources. The project followed an individual Scrum approach with three-week sprints. Across 30 simulated falls, 100% of the alerts reached the dashboard via WebSocket, with an average latency of 1,577 ms on Render and 216 ms on AWS EC2, and 100% of the ntfy notifications reached the caregiver's phone (30/30). Without internet access, the edge mode with SQLite stored and displayed on the local dashboard 100% of the falls (10/10). In production, the API rejected 100% of the sensor requests without a valid key and of the attempts to acknowledge an alert without a caregiver session. </w:t>
       </w:r>
       <w:r>
         <w:rPr>
@@ -2249,7 +2249,7 @@
                 <w:color w:val="262626"/>
                 <w:sz w:val="21"/>
               </w:rPr>
-              <w:t xml:space="preserve">En el prototipo, una caída simulada genera una alerta que llega al panel del cuidador en 216 ms en promedio cuando el backend y la base de datos están en la misma máquina (AWS EC2), y en 1.577 ms cuando están en regiones distintas (Render y Supabase). La alerta también llega al celular mediante ntfy: en la prueba PR-02 llegaron 30 de 30 avisos (100 %). Además, sin internet el sistema sigue registrando y mostrando las caídas en el hogar (prueba PR-03). Los datos se exponen como recursos HL7 FHIR (Observation y Patient seudonimizado), el RUT se seudonimiza, solo los sensores con la clave de API pueden enviar datos y el sistema funciona sobre servicios gratuitos, con un costo menor a USD 0,10 en las pruebas en AWS. </w:t>
+              <w:t xml:space="preserve">En el prototipo, una caída simulada genera una alerta que llega al panel del cuidador en 216 ms en promedio cuando el backend y la base de datos están en la misma máquina (AWS EC2), y en 1.577 ms cuando están en regiones distintas (Render y Supabase). La alerta también llega al celular mediante ntfy: en la prueba PR-02 llegaron 30 de 30 avisos (100 %). Además, sin internet el sistema sigue registrando y mostrando las caídas en el hogar (prueba PR-03). Los datos se exponen como recursos HL7 FHIR (Observation y Patient seudonimizado), el RUT se seudonimiza, solo los sensores con la clave de API pueden enviar datos, solo el cuidador con sesión iniciada puede atender una alerta (queda registrado quién la atendió) y el sistema funciona sobre servicios gratuitos, con un costo menor a USD 0,10 en las pruebas en AWS. </w:t>
             </w:r>
             <w:r>
               <w:rPr>
@@ -2376,7 +2376,7 @@
                 <w:color w:val="262626"/>
                 <w:sz w:val="21"/>
               </w:rPr>
-              <w:t>• OE2. Backend, datos y protección de datos: API REST asíncrona en FastAPI (Ramírez, 2023) con persistencia en Supabase/PostgreSQL (Supabase Inc., 2024), triggers, seudonimización, RLS y diseño compatible con HL7 FHIR R4. Estado: implementado en el alcance del prototipo. Los recursos FHIR Observation, Bundle y Patient seudonimizado (sin nombre, RUT ni dirección) son válidos según FHIR R4 (PI-04 y PI-05, 8/8). Los sensores se autentican con una clave de API (PS-01, 3/3 en producción); la autenticación del cuidador en el panel queda planificada para el Sprint 5.</w:t>
+              <w:t>• OE2. Backend, datos y protección de datos: API REST asíncrona en FastAPI (Ramírez, 2023) con persistencia en Supabase/PostgreSQL (Supabase Inc., 2024), triggers, seudonimización, RLS y diseño compatible con HL7 FHIR R4. Estado: implementado en el alcance del prototipo. Los recursos FHIR Observation, Bundle y Patient seudonimizado (sin nombre, RUT ni dirección) son válidos según FHIR R4 (PI-04 y PI-05, 8/8). Los sensores se autentican con una clave de API (PS-01, 3/3 en producción) y el cuidador inicia sesión con Supabase Auth para atender alertas, con registro de quién atendió cada una (PS-01b, 3/3 en producción); la tabla de sensores también quedó protegida con RLS (PI-03b).</w:t>
             </w:r>
           </w:p>
           <w:p>
@@ -2674,7 +2674,7 @@
                 <w:color w:val="262626"/>
                 <w:sz w:val="21"/>
               </w:rPr>
-              <w:t xml:space="preserve">• Sprint 4 (Fase 2): prueba de entrega de notificaciones ntfy (PR-02, 30/30), prueba de continuidad sin conexión en modo borde (PR-03, 10/10), ajustes del panel (componentes simulados, base de datos en uso y alertas atendidas), regla de la puerta principal (PU-04, 10/10), clave de API para los sensores (PS-01, 3/3 en producción), recurso FHIR Patient seudonimizado (PI-05, 8/8) y documentación de la Fase 2. </w:t>
+              <w:t xml:space="preserve">• Sprint 4 (Fase 2): prueba de entrega de notificaciones ntfy (PR-02, 30/30), prueba de continuidad sin conexión en modo borde (PR-03, 10/10), ajustes del panel (componentes simulados, base de datos en uso y alertas atendidas), regla de la puerta principal (PU-04, 10/10), clave de API para los sensores (PS-01, 3/3 en producción), inicio de sesión del cuidador con Supabase Auth (PS-01b, 3/3 en producción), RLS en la tabla de sensores (PI-03b), recurso FHIR Patient seudonimizado (PI-05, 8/8) y documentación de la Fase 2. </w:t>
             </w:r>
             <w:r>
               <w:rPr>
@@ -2926,22 +2926,6 @@
           </w:p>
           <w:p>
             <w:pPr>
-              <w:keepNext/>
-              <w:spacing w:after="80" w:before="80"/>
-            </w:pPr>
-            <w:r>
-              <w:rPr>
-                <w:rFonts w:ascii="Calibri" w:hAnsi="Calibri" w:cs="Calibri"/>
-                <w:b/>
-                <w:i w:val="0"/>
-                <w:color w:val="1F3864"/>
-                <w:sz w:val="22"/>
-              </w:rPr>
-              <w:t>Ajustes realizados</w:t>
-            </w:r>
-          </w:p>
-          <w:p>
-            <w:pPr>
               <w:spacing w:after="80" w:before="0"/>
               <w:ind w:left="255" w:hanging="198"/>
               <w:jc w:val="both"/>
@@ -2954,7 +2938,23 @@
                 <w:color w:val="262626"/>
                 <w:sz w:val="21"/>
               </w:rPr>
-              <w:t>• HL7 FHIR adelantado al Sprint 3, porque el backend estaba estable y la interoperabilidad es clave para integrarse con sistemas de salud.</w:t>
+              <w:t>• Al configurar Supabase Auth, el asesor de seguridad de Supabase detectó una tabla sin RLS (sensores), que se corrigió de inmediato; la protección contra contraseñas filtradas requiere un plan pagado y quedó como riesgo aceptado del prototipo.</w:t>
+            </w:r>
+          </w:p>
+          <w:p>
+            <w:pPr>
+              <w:keepNext/>
+              <w:spacing w:after="80" w:before="80"/>
+            </w:pPr>
+            <w:r>
+              <w:rPr>
+                <w:rFonts w:ascii="Calibri" w:hAnsi="Calibri" w:cs="Calibri"/>
+                <w:b/>
+                <w:i w:val="0"/>
+                <w:color w:val="1F3864"/>
+                <w:sz w:val="22"/>
+              </w:rPr>
+              <w:t>Ajustes realizados</w:t>
             </w:r>
           </w:p>
           <w:p>
@@ -2971,7 +2971,7 @@
                 <w:color w:val="262626"/>
                 <w:sz w:val="21"/>
               </w:rPr>
-              <w:t>• Bitácora en Obsidian reemplazada por fichas de sprint, registro de pruebas y tablero Kanban en GitHub, más trazables para el docente.</w:t>
+              <w:t>• HL7 FHIR adelantado al Sprint 3, porque el backend estaba estable y la interoperabilidad es clave para integrarse con sistemas de salud.</w:t>
             </w:r>
           </w:p>
           <w:p>
@@ -2988,7 +2988,7 @@
                 <w:color w:val="262626"/>
                 <w:sz w:val="21"/>
               </w:rPr>
-              <w:t>• WebSocket enviado antes que ntfy, lo que redujo la latencia en un 17 %.</w:t>
+              <w:t>• Bitácora en Obsidian reemplazada por fichas de sprint, registro de pruebas y tablero Kanban en GitHub, más trazables para el docente.</w:t>
             </w:r>
           </w:p>
           <w:p>
@@ -3005,7 +3005,7 @@
                 <w:color w:val="262626"/>
                 <w:sz w:val="21"/>
               </w:rPr>
-              <w:t>• Entorno de prueba con Docker en AWS EC2 y despliegue planificado en Oracle Cloud Santiago, para acercar el servidor a los usuarios en Chile.</w:t>
+              <w:t>• WebSocket enviado antes que ntfy, lo que redujo la latencia en un 17 %.</w:t>
             </w:r>
           </w:p>
           <w:p>
@@ -3022,7 +3022,7 @@
                 <w:color w:val="262626"/>
                 <w:sz w:val="21"/>
               </w:rPr>
-              <w:t>• Nueva práctica: verificar el despliegue después de cada git push y revisar el panel cada semana.</w:t>
+              <w:t>• Entorno de prueba con Docker en AWS EC2 y despliegue planificado en Oracle Cloud Santiago, para acercar el servidor a los usuarios en Chile.</w:t>
             </w:r>
           </w:p>
           <w:p>
@@ -3039,7 +3039,24 @@
                 <w:color w:val="262626"/>
                 <w:sz w:val="21"/>
               </w:rPr>
-              <w:t>• Seguridad: la revisión de PS-01 mostró que la API no tenía autenticación; se agregó una clave de API para los sensores, guardada como variable de entorno y nunca en el repositorio.</w:t>
+              <w:t>• Nueva práctica: verificar el despliegue después de cada git push y revisar el panel cada semana.</w:t>
+            </w:r>
+          </w:p>
+          <w:p>
+            <w:pPr>
+              <w:spacing w:after="80" w:before="0"/>
+              <w:ind w:left="255" w:hanging="198"/>
+              <w:jc w:val="both"/>
+            </w:pPr>
+            <w:r>
+              <w:rPr>
+                <w:rFonts w:ascii="Calibri" w:hAnsi="Calibri" w:cs="Calibri"/>
+                <w:b w:val="0"/>
+                <w:i w:val="0"/>
+                <w:color w:val="262626"/>
+                <w:sz w:val="21"/>
+              </w:rPr>
+              <w:t>• Seguridad: la revisión de PS-01 mostró que la API no tenía autenticación; se agregó una clave de API para los sensores, guardada como variable de entorno y nunca en el repositorio, y el inicio de sesión del cuidador con Supabase Auth para atender alertas.</w:t>
             </w:r>
           </w:p>
           <w:p>
@@ -3412,6 +3429,23 @@
                 <w:color w:val="262626"/>
                 <w:sz w:val="21"/>
               </w:rPr>
+              <w:t>• E16. Prueba PS-01b: atender una alerta sin sesión o con un token falso responde 401 y con la sesión del cuidador 200, registrando su correo; RLS activado en la tabla sensores (PI-03b) (OE2, Figura 18).</w:t>
+            </w:r>
+          </w:p>
+          <w:p>
+            <w:pPr>
+              <w:spacing w:after="80" w:before="0"/>
+              <w:ind w:left="255" w:hanging="198"/>
+              <w:jc w:val="both"/>
+            </w:pPr>
+            <w:r>
+              <w:rPr>
+                <w:rFonts w:ascii="Calibri" w:hAnsi="Calibri" w:cs="Calibri"/>
+                <w:b w:val="0"/>
+                <w:i w:val="0"/>
+                <w:color w:val="262626"/>
+                <w:sz w:val="21"/>
+              </w:rPr>
               <w:t xml:space="preserve">• </w:t>
             </w:r>
             <w:r>
@@ -3423,7 +3457,7 @@
                 <w:sz w:val="21"/>
                 <w:highlight w:val="yellow"/>
               </w:rPr>
-              <w:t>E16. Comparación de latencia Render, AWS EC2 y Oracle Cloud Santiago.</w:t>
+              <w:t>E17. Comparación de latencia Render, AWS EC2 y Oracle Cloud Santiago.</w:t>
             </w:r>
           </w:p>
         </w:tc>
@@ -4797,6 +4831,63 @@
     </w:p>
     <w:p>
       <w:pPr>
+        <w:keepNext/>
+        <w:spacing w:after="40" w:before="0"/>
+        <w:jc w:val="center"/>
+      </w:pPr>
+      <w:r>
+        <w:drawing>
+          <wp:inline xmlns:a="http://schemas.openxmlformats.org/drawingml/2006/main" xmlns:pic="http://schemas.openxmlformats.org/drawingml/2006/picture">
+            <wp:extent cx="5400000" cy="2868750"/>
+            <wp:docPr id="73" name="Picture 73"/>
+            <wp:cNvGraphicFramePr>
+              <a:graphicFrameLocks noChangeAspect="1"/>
+            </wp:cNvGraphicFramePr>
+            <a:graphic>
+              <a:graphicData uri="http://schemas.openxmlformats.org/drawingml/2006/picture">
+                <pic:pic>
+                  <pic:nvPicPr>
+                    <pic:cNvPr id="0" name="PS-01b_produccion_3de3.png"/>
+                    <pic:cNvPicPr/>
+                  </pic:nvPicPr>
+                  <pic:blipFill>
+                    <a:blip r:embed="rId30"/>
+                    <a:stretch>
+                      <a:fillRect/>
+                    </a:stretch>
+                  </pic:blipFill>
+                  <pic:spPr>
+                    <a:xfrm>
+                      <a:off x="0" y="0"/>
+                      <a:ext cx="5400000" cy="2868750"/>
+                    </a:xfrm>
+                    <a:prstGeom prst="rect"/>
+                  </pic:spPr>
+                </pic:pic>
+              </a:graphicData>
+            </a:graphic>
+          </wp:inline>
+        </w:drawing>
+      </w:r>
+    </w:p>
+    <w:p>
+      <w:pPr>
+        <w:spacing w:after="200" w:before="0"/>
+        <w:jc w:val="center"/>
+      </w:pPr>
+      <w:r>
+        <w:rPr>
+          <w:rFonts w:ascii="Calibri" w:hAnsi="Calibri" w:cs="Calibri"/>
+          <w:b w:val="0"/>
+          <w:i/>
+          <w:color w:val="404040"/>
+          <w:sz w:val="19"/>
+        </w:rPr>
+        <w:t>Figura 18. PS-01b en producción: sin sesión y con token falso 401; con la sesión del cuidador 200 y su correo en resuelto_por (E16).</w:t>
+      </w:r>
+    </w:p>
+    <w:p>
+      <w:pPr>
         <w:spacing w:after="0" w:before="0"/>
         <w:jc w:val="both"/>
       </w:pPr>
@@ -4960,7 +5051,7 @@
           <w:color w:val="262626"/>
           <w:sz w:val="22"/>
         </w:rPr>
-        <w:t>The offline test also revealed a gap: events stored locally are not synchronized with the cloud when the connection returns. Security was strengthened with an API key for the sensors (3/3 in production), and interoperability was completed with a pseudonymized FHIR Patient resource. The next steps are to implement store-and-forward synchronization, add caregiver login to the dashboard and evaluate usability with caregivers in Phase 3.</w:t>
+        <w:t>The offline test also revealed a gap: events stored locally are not synchronized with the cloud when the connection returns. Security was strengthened with an API key for the sensors and caregiver login with Supabase Auth (3/3 in production in both tests), and interoperability was completed with a pseudonymized FHIR Patient resource. The next steps are to implement store-and-forward synchronization, protect the read endpoints of the API and evaluate usability with caregivers in Phase 3.</w:t>
       </w:r>
     </w:p>
     <w:p>
@@ -5430,8 +5521,8 @@
     <w:p/>
     <w:sectPr>
       <w:headerReference w:type="default" r:id="rId11"/>
-      <w:headerReference w:type="first" r:id="rId30"/>
-      <w:footerReference w:type="default" r:id="rId31"/>
+      <w:headerReference w:type="first" r:id="rId31"/>
+      <w:footerReference w:type="default" r:id="rId32"/>
       <w:pgSz w:w="11906" w:h="16838"/>
       <w:pgMar w:top="1417" w:right="1701" w:bottom="1417" w:left="1701" w:header="708" w:footer="708" w:gutter="0"/>
       <w:cols w:space="708"/>

</xml_diff>

<commit_message>
docs: informe 2.6 con sprints alineados al calendario y HU-03 reabierta
</commit_message>
<xml_diff>
--- a/docs/fase2/evidencias_grupales/VERGARA_ANDRES_2.6_GuiaEstudiante_Fase 2_Informe Final Proyecto APT.docx
+++ b/docs/fase2/evidencias_grupales/VERGARA_ANDRES_2.6_GuiaEstudiante_Fase 2_Informe Final Proyecto APT.docx
@@ -2359,7 +2359,7 @@
                 <w:color w:val="262626"/>
                 <w:sz w:val="21"/>
               </w:rPr>
-              <w:t>• OE1. Captura y detección en el borde: simulador de 8 sensores y detección por reglas de umbral, con persistencia local en SQLite3 (Hipp, 2024). Estado: implementado y validado en el alcance del prototipo: sin internet, el modo borde guardó en SQLite y mostró en el panel local 10 de 10 caídas (PR-03, hito H3). La sincronización automática con la nube al volver la conexión queda como mejora planificada.</w:t>
+              <w:t>• OE1. Captura y detección en el borde: simulador de 8 sensores y detección por reglas de umbral, con persistencia local en SQLite3 (Hipp, 2024). Estado: implementado y validado en el alcance del prototipo: sin internet, el modo borde guardó en SQLite y mostró en el panel local 10 de 10 caídas (PR-03, hito H3). La historia HU-03 queda reabierta, porque su criterio exige sincronizar el 100 % de los eventos con Supabase al volver la conexión, y esa sincronización se implementará en el Sprint 4.</w:t>
             </w:r>
           </w:p>
           <w:p>
@@ -2640,7 +2640,7 @@
                 <w:color w:val="262626"/>
                 <w:sz w:val="21"/>
               </w:rPr>
-              <w:t>• Sprints 1 y 2 (Fase 1): definición del problema, requisitos, Product Backlog, arquitectura Edge-Cloud, modelo de datos, matriz de riesgos y Guía 1.5.</w:t>
+              <w:t>• Sprint 1 (S1–S3, Fase 1): definición del problema, requisitos, Product Backlog y creación del repositorio.</w:t>
             </w:r>
           </w:p>
           <w:p>
@@ -2657,7 +2657,7 @@
                 <w:color w:val="262626"/>
                 <w:sz w:val="21"/>
               </w:rPr>
-              <w:t>• Sprint 3 (Fase 2): simulador de 8 sensores, reglas de umbral, API FastAPI, sincronización con Supabase mediante triggers, panel React en Vercel, alertas por WebSocket y ntfy, seudonimización y RLS, implementación inicial de HL7 FHIR, réplica con Docker en AWS EC2 y pruebas PU-03, PI-02, PI-03, PI-04 y PR-01.</w:t>
+              <w:t>• Sprint 2 (S4–S6, Fase 1): arquitectura Edge-Cloud, modelo de datos, matriz de riesgos y Guía 1.5; además se adelantó el simulador de 8 sensores con reglas de umbral (OE1).</w:t>
             </w:r>
           </w:p>
           <w:p>
@@ -2674,7 +2674,24 @@
                 <w:color w:val="262626"/>
                 <w:sz w:val="21"/>
               </w:rPr>
-              <w:t xml:space="preserve">• Sprint 4 (Fase 2): prueba de entrega de notificaciones ntfy (PR-02, 30/30), prueba de continuidad sin conexión en modo borde (PR-03, 10/10), ajustes del panel (componentes simulados, base de datos en uso y alertas atendidas), regla de la puerta principal (PU-04, 10/10), clave de API para los sensores (PS-01, 3/3 en producción), inicio de sesión del cuidador con Supabase Auth (PS-01b, 3/3 en producción), RLS en la tabla de sensores (PI-03b), recurso FHIR Patient seudonimizado (PI-05, 8/8) y documentación de la Fase 2. </w:t>
+              <w:t>• Sprint 3, primera parte (S7–S9, Fase 2, del 21/09 al 01/10): API FastAPI, sincronización con Supabase mediante triggers, panel React en Vercel, alertas por WebSocket y ntfy, seudonimización y RLS, y réplica con Docker en AWS EC2.</w:t>
+            </w:r>
+          </w:p>
+          <w:p>
+            <w:pPr>
+              <w:spacing w:after="80" w:before="0"/>
+              <w:ind w:left="255" w:hanging="198"/>
+              <w:jc w:val="both"/>
+            </w:pPr>
+            <w:r>
+              <w:rPr>
+                <w:rFonts w:ascii="Calibri" w:hAnsi="Calibri" w:cs="Calibri"/>
+                <w:b w:val="0"/>
+                <w:i w:val="0"/>
+                <w:color w:val="262626"/>
+                <w:sz w:val="21"/>
+              </w:rPr>
+              <w:t xml:space="preserve">• Sprint 3, segunda parte (del 02/10 al 06/10, trabajo adelantado del Sprint 4): implementación inicial de HL7 FHIR (PI-04) y pruebas PU-03, PI-02, PI-03 y PR-01; prueba de entrega de notificaciones ntfy (PR-02, 30/30); prueba de continuidad sin conexión en modo borde (PR-03, 10/10); ajustes del panel (componentes simulados, base de datos en uso y alertas atendidas); regla de la puerta principal (PU-04, 10/10); clave de API para los sensores (PS-01, 3/3 en producción); inicio de sesión del cuidador con Supabase Auth (PS-01b, 3/3 en producción); RLS en la tabla de sensores (PI-03b); recurso FHIR Patient seudonimizado (PI-05, 8/8), y documentación de la Fase 2 (matriz de trazabilidad, Product Vision y Product Backlog actualizado). El Sprint 3 cierra el 11/10. </w:t>
             </w:r>
             <w:r>
               <w:rPr>
@@ -2686,6 +2703,23 @@
                 <w:highlight w:val="yellow"/>
               </w:rPr>
               <w:t>Pendiente: despliegue en Oracle Cloud Santiago (la región no tenía capacidad para las máquinas gratuitas el 03-10 y el 05-10-2026).</w:t>
+            </w:r>
+          </w:p>
+          <w:p>
+            <w:pPr>
+              <w:spacing w:after="80" w:before="0"/>
+              <w:ind w:left="255" w:hanging="198"/>
+              <w:jc w:val="both"/>
+            </w:pPr>
+            <w:r>
+              <w:rPr>
+                <w:rFonts w:ascii="Calibri" w:hAnsi="Calibri" w:cs="Calibri"/>
+                <w:b w:val="0"/>
+                <w:i w:val="0"/>
+                <w:color w:val="262626"/>
+                <w:sz w:val="21"/>
+              </w:rPr>
+              <w:t>• Sprint 4 (S10–S12, del 12/10 al 01/11): sincronización de los eventos del modo borde con Supabase al volver la conexión (HU-03, reabierta), protección de las consultas de lectura de la API (HU-17) y diagramas UML y manual técnico.</w:t>
             </w:r>
           </w:p>
           <w:p>

</xml_diff>

<commit_message>
docs(2.6): informe alineado con migraciones y alertas como fuente unica (E17, Figura 19)
</commit_message>
<xml_diff>
--- a/docs/fase2/evidencias_grupales/VERGARA_ANDRES_2.6_GuiaEstudiante_Fase 2_Informe Final Proyecto APT.docx
+++ b/docs/fase2/evidencias_grupales/VERGARA_ANDRES_2.6_GuiaEstudiante_Fase 2_Informe Final Proyecto APT.docx
@@ -1192,7 +1192,7 @@
           <w:color w:val="262626"/>
           <w:sz w:val="22"/>
         </w:rPr>
-        <w:t>10</w:t>
+        <w:t>11</w:t>
       </w:r>
     </w:p>
     <w:p>
@@ -1223,7 +1223,7 @@
           <w:color w:val="262626"/>
           <w:sz w:val="22"/>
         </w:rPr>
-        <w:t>18</w:t>
+        <w:t>20</w:t>
       </w:r>
     </w:p>
     <w:p>
@@ -1254,7 +1254,7 @@
           <w:color w:val="262626"/>
           <w:sz w:val="22"/>
         </w:rPr>
-        <w:t>18</w:t>
+        <w:t>20</w:t>
       </w:r>
     </w:p>
     <w:p>
@@ -1285,7 +1285,7 @@
           <w:color w:val="262626"/>
           <w:sz w:val="22"/>
         </w:rPr>
-        <w:t>18</w:t>
+        <w:t>20</w:t>
       </w:r>
     </w:p>
     <w:p>
@@ -2691,7 +2691,7 @@
                 <w:color w:val="262626"/>
                 <w:sz w:val="21"/>
               </w:rPr>
-              <w:t xml:space="preserve">• Sprint 3, segunda parte (del 02/10 al 06/10, trabajo adelantado del Sprint 4): implementación inicial de HL7 FHIR (PI-04) y pruebas PU-03, PI-02, PI-03 y PR-01; prueba de entrega de notificaciones ntfy (PR-02, 30/30); prueba de continuidad sin conexión en modo borde (PR-03, 10/10); ajustes del panel (componentes simulados, base de datos en uso y alertas atendidas); regla de la puerta principal (PU-04, 10/10); clave de API para los sensores (PS-01, 3/3 en producción); inicio de sesión del cuidador con Supabase Auth (PS-01b, 3/3 en producción); RLS en la tabla de sensores (PI-03b); recurso FHIR Patient seudonimizado (PI-05, 8/8), y documentación de la Fase 2 (matriz de trazabilidad, Product Vision y Product Backlog actualizado). El Sprint 3 cierra el 11/10. </w:t>
+              <w:t xml:space="preserve">• Sprint 3, segunda parte (del 02/10 al 06/10, trabajo adelantado del Sprint 4): implementación inicial de HL7 FHIR (PI-04) y pruebas PU-03, PI-02, PI-03 y PR-01; prueba de entrega de notificaciones ntfy (PR-02, 30/30); prueba de continuidad sin conexión en modo borde (PR-03, 10/10); ajustes del panel (componentes simulados, base de datos en uso y alertas atendidas); regla de la puerta principal (PU-04, 10/10); clave de API para los sensores (PS-01, 3/3 en producción); inicio de sesión del cuidador con Supabase Auth (PS-01b, 3/3 en producción); RLS en la tabla de sensores (PI-03b); recurso FHIR Patient seudonimizado (PI-05, 8/8); migraciones versionadas de la base de datos, fechas en UTC con zona horaria y la tabla alertas como fuente única de la atención (PU-05, PU-06, PI-06 y PI-07), y documentación de la Fase 2 (matriz de trazabilidad, Product Vision y Product Backlog actualizado). El Sprint 3 cierra el 11/10. </w:t>
             </w:r>
             <w:r>
               <w:rPr>
@@ -2972,23 +2972,7 @@
                 <w:color w:val="262626"/>
                 <w:sz w:val="21"/>
               </w:rPr>
-              <w:t>• Al configurar Supabase Auth, el asesor de seguridad de Supabase detectó una tabla sin RLS (sensores), que se corrigió de inmediato; la protección contra contraseñas filtradas requiere un plan pagado y quedó como riesgo aceptado del prototipo.</w:t>
-            </w:r>
-          </w:p>
-          <w:p>
-            <w:pPr>
-              <w:keepNext/>
-              <w:spacing w:after="80" w:before="80"/>
-            </w:pPr>
-            <w:r>
-              <w:rPr>
-                <w:rFonts w:ascii="Calibri" w:hAnsi="Calibri" w:cs="Calibri"/>
-                <w:b/>
-                <w:i w:val="0"/>
-                <w:color w:val="1F3864"/>
-                <w:sz w:val="22"/>
-              </w:rPr>
-              <w:t>Ajustes realizados</w:t>
+              <w:t>• Al documentar el modelo de datos se detectaron horas mezcladas (hora de Chile y UTC en la misma columna) y 1.463 alertas cuya atención estaba registrada solo en la tabla eventos.</w:t>
             </w:r>
           </w:p>
           <w:p>
@@ -3005,7 +2989,23 @@
                 <w:color w:val="262626"/>
                 <w:sz w:val="21"/>
               </w:rPr>
-              <w:t>• HL7 FHIR adelantado al Sprint 3, porque el backend estaba estable y la interoperabilidad es clave para integrarse con sistemas de salud.</w:t>
+              <w:t>• Al configurar Supabase Auth, el asesor de seguridad de Supabase detectó una tabla sin RLS (sensores), que se corrigió de inmediato; la protección contra contraseñas filtradas requiere un plan pagado y quedó como riesgo aceptado del prototipo.</w:t>
+            </w:r>
+          </w:p>
+          <w:p>
+            <w:pPr>
+              <w:keepNext/>
+              <w:spacing w:after="80" w:before="80"/>
+            </w:pPr>
+            <w:r>
+              <w:rPr>
+                <w:rFonts w:ascii="Calibri" w:hAnsi="Calibri" w:cs="Calibri"/>
+                <w:b/>
+                <w:i w:val="0"/>
+                <w:color w:val="1F3864"/>
+                <w:sz w:val="22"/>
+              </w:rPr>
+              <w:t>Ajustes realizados</w:t>
             </w:r>
           </w:p>
           <w:p>
@@ -3022,7 +3022,7 @@
                 <w:color w:val="262626"/>
                 <w:sz w:val="21"/>
               </w:rPr>
-              <w:t>• Bitácora en Obsidian reemplazada por fichas de sprint, registro de pruebas y tablero Kanban en GitHub, más trazables para el docente.</w:t>
+              <w:t>• HL7 FHIR adelantado al Sprint 3, porque el backend estaba estable y la interoperabilidad es clave para integrarse con sistemas de salud.</w:t>
             </w:r>
           </w:p>
           <w:p>
@@ -3039,7 +3039,7 @@
                 <w:color w:val="262626"/>
                 <w:sz w:val="21"/>
               </w:rPr>
-              <w:t>• WebSocket enviado antes que ntfy, lo que redujo la latencia en un 17 %.</w:t>
+              <w:t>• Bitácora en Obsidian reemplazada por fichas de sprint, registro de pruebas y tablero Kanban en GitHub, más trazables para el docente.</w:t>
             </w:r>
           </w:p>
           <w:p>
@@ -3056,7 +3056,7 @@
                 <w:color w:val="262626"/>
                 <w:sz w:val="21"/>
               </w:rPr>
-              <w:t>• Entorno de prueba con Docker en AWS EC2 y despliegue planificado en Oracle Cloud Santiago, para acercar el servidor a los usuarios en Chile.</w:t>
+              <w:t>• WebSocket enviado antes que ntfy, lo que redujo la latencia en un 17 %.</w:t>
             </w:r>
           </w:p>
           <w:p>
@@ -3073,7 +3073,7 @@
                 <w:color w:val="262626"/>
                 <w:sz w:val="21"/>
               </w:rPr>
-              <w:t>• Nueva práctica: verificar el despliegue después de cada git push y revisar el panel cada semana.</w:t>
+              <w:t>• Entorno de prueba con Docker en AWS EC2 y despliegue planificado en Oracle Cloud Santiago, para acercar el servidor a los usuarios en Chile.</w:t>
             </w:r>
           </w:p>
           <w:p>
@@ -3090,7 +3090,7 @@
                 <w:color w:val="262626"/>
                 <w:sz w:val="21"/>
               </w:rPr>
-              <w:t>• Seguridad: la revisión de PS-01 mostró que la API no tenía autenticación; se agregó una clave de API para los sensores, guardada como variable de entorno y nunca en el repositorio, y el inicio de sesión del cuidador con Supabase Auth para atender alertas.</w:t>
+              <w:t>• Nueva práctica: verificar el despliegue después de cada git push y revisar el panel cada semana.</w:t>
             </w:r>
           </w:p>
           <w:p>
@@ -3107,7 +3107,7 @@
                 <w:color w:val="262626"/>
                 <w:sz w:val="21"/>
               </w:rPr>
-              <w:t>• Regla de la puerta principal trasladada del simulador al backend: alerta solo si se abre de noche o si queda abierta 10 minutos o más, para reducir falsas alarmas.</w:t>
+              <w:t>• Seguridad: la revisión de PS-01 mostró que la API no tenía autenticación; se agregó una clave de API para los sensores, guardada como variable de entorno y nunca en el repositorio, y el inicio de sesión del cuidador con Supabase Auth para atender alertas.</w:t>
             </w:r>
           </w:p>
           <w:p>
@@ -3124,7 +3124,41 @@
                 <w:color w:val="262626"/>
                 <w:sz w:val="21"/>
               </w:rPr>
+              <w:t>• Regla de la puerta principal trasladada del simulador al backend: alerta solo si se abre de noche o si queda abierta 10 minutos o más, para reducir falsas alarmas.</w:t>
+            </w:r>
+          </w:p>
+          <w:p>
+            <w:pPr>
+              <w:spacing w:after="80" w:before="0"/>
+              <w:ind w:left="255" w:hanging="198"/>
+              <w:jc w:val="both"/>
+            </w:pPr>
+            <w:r>
+              <w:rPr>
+                <w:rFonts w:ascii="Calibri" w:hAnsi="Calibri" w:cs="Calibri"/>
+                <w:b w:val="0"/>
+                <w:i w:val="0"/>
+                <w:color w:val="262626"/>
+                <w:sz w:val="21"/>
+              </w:rPr>
               <w:t>• Panel más honesto con el estado real: la Raspberry Pi y MQTT se muestran como simulados y la tarjeta de base de datos indica si se usa Supabase o SQLite.</w:t>
+            </w:r>
+          </w:p>
+          <w:p>
+            <w:pPr>
+              <w:spacing w:after="80" w:before="0"/>
+              <w:ind w:left="255" w:hanging="198"/>
+              <w:jc w:val="both"/>
+            </w:pPr>
+            <w:r>
+              <w:rPr>
+                <w:rFonts w:ascii="Calibri" w:hAnsi="Calibri" w:cs="Calibri"/>
+                <w:b w:val="0"/>
+                <w:i w:val="0"/>
+                <w:color w:val="262626"/>
+                <w:sz w:val="21"/>
+              </w:rPr>
+              <w:t>• Base de datos: los cambios de estructura pasaron a migraciones versionadas en el repositorio, con respaldo previo; las fechas se guardan en UTC con zona horaria y la alerta la crea el backend, con la tabla alertas como fuente única de la atención (etapas 1 y 3 de la ficha técnica 19).</w:t>
             </w:r>
           </w:p>
           <w:p>
@@ -3276,7 +3310,7 @@
                 <w:color w:val="262626"/>
                 <w:sz w:val="21"/>
               </w:rPr>
-              <w:t>• E5. Trigger de alertas en Supabase, PI-02 (OE2, Figura 8).</w:t>
+              <w:t>• E5. Generación automática de cada alerta con su severidad, PI-02 (OE2, Figura 8).</w:t>
             </w:r>
           </w:p>
           <w:p>
@@ -3480,6 +3514,23 @@
                 <w:color w:val="262626"/>
                 <w:sz w:val="21"/>
               </w:rPr>
+              <w:t>• E17. Pruebas PI-06 y PI-07: migraciones de la base con respaldo y medición antes y después; fechas en UTC sin pérdida de datos y 1.463 inconsistencias de atención corregidas a 0 (OE2, Figura 19).</w:t>
+            </w:r>
+          </w:p>
+          <w:p>
+            <w:pPr>
+              <w:spacing w:after="80" w:before="0"/>
+              <w:ind w:left="255" w:hanging="198"/>
+              <w:jc w:val="both"/>
+            </w:pPr>
+            <w:r>
+              <w:rPr>
+                <w:rFonts w:ascii="Calibri" w:hAnsi="Calibri" w:cs="Calibri"/>
+                <w:b w:val="0"/>
+                <w:i w:val="0"/>
+                <w:color w:val="262626"/>
+                <w:sz w:val="21"/>
+              </w:rPr>
               <w:t xml:space="preserve">• </w:t>
             </w:r>
             <w:r>
@@ -3491,7 +3542,7 @@
                 <w:sz w:val="21"/>
                 <w:highlight w:val="yellow"/>
               </w:rPr>
-              <w:t>E17. Comparación de latencia Render, AWS EC2 y Oracle Cloud Santiago.</w:t>
+              <w:t>E18. Comparación de latencia Render, AWS EC2 y Oracle Cloud Santiago.</w:t>
             </w:r>
           </w:p>
         </w:tc>
@@ -4922,6 +4973,63 @@
     </w:p>
     <w:p>
       <w:pPr>
+        <w:keepNext/>
+        <w:spacing w:after="40" w:before="0"/>
+        <w:jc w:val="center"/>
+      </w:pPr>
+      <w:r>
+        <w:drawing>
+          <wp:inline xmlns:a="http://schemas.openxmlformats.org/drawingml/2006/main" xmlns:pic="http://schemas.openxmlformats.org/drawingml/2006/picture">
+            <wp:extent cx="5400000" cy="1698876"/>
+            <wp:docPr id="74" name="Picture 74"/>
+            <wp:cNvGraphicFramePr>
+              <a:graphicFrameLocks noChangeAspect="1"/>
+            </wp:cNvGraphicFramePr>
+            <a:graphic>
+              <a:graphicData uri="http://schemas.openxmlformats.org/drawingml/2006/picture">
+                <pic:pic>
+                  <pic:nvPicPr>
+                    <pic:cNvPr id="0" name="PI-07_antes_despues_migracion_002.png"/>
+                    <pic:cNvPicPr/>
+                  </pic:nvPicPr>
+                  <pic:blipFill>
+                    <a:blip r:embed="rId31"/>
+                    <a:stretch>
+                      <a:fillRect/>
+                    </a:stretch>
+                  </pic:blipFill>
+                  <pic:spPr>
+                    <a:xfrm>
+                      <a:off x="0" y="0"/>
+                      <a:ext cx="5400000" cy="1698876"/>
+                    </a:xfrm>
+                    <a:prstGeom prst="rect"/>
+                  </pic:spPr>
+                </pic:pic>
+              </a:graphicData>
+            </a:graphic>
+          </wp:inline>
+        </w:drawing>
+      </w:r>
+    </w:p>
+    <w:p>
+      <w:pPr>
+        <w:spacing w:after="200" w:before="0"/>
+        <w:jc w:val="center"/>
+      </w:pPr>
+      <w:r>
+        <w:rPr>
+          <w:rFonts w:ascii="Calibri" w:hAnsi="Calibri" w:cs="Calibri"/>
+          <w:b w:val="0"/>
+          <w:i/>
+          <w:color w:val="404040"/>
+          <w:sz w:val="19"/>
+        </w:rPr>
+        <w:t>Figura 19. PI-07: consulta en Supabase antes y después de la migración 002; las diferencias de atención entre eventos y alertas bajan de 1.463 a 0 (E17).</w:t>
+      </w:r>
+    </w:p>
+    <w:p>
+      <w:pPr>
         <w:spacing w:after="0" w:before="0"/>
         <w:jc w:val="both"/>
       </w:pPr>
@@ -5085,7 +5193,7 @@
           <w:color w:val="262626"/>
           <w:sz w:val="22"/>
         </w:rPr>
-        <w:t>The offline test also revealed a gap: events stored locally are not synchronized with the cloud when the connection returns. Security was strengthened with an API key for the sensors and caregiver login with Supabase Auth (3/3 in production in both tests), and interoperability was completed with a pseudonymized FHIR Patient resource. The next steps are to implement store-and-forward synchronization, protect the read endpoints of the API and evaluate usability with caregivers in Phase 3.</w:t>
+        <w:t>The offline test also revealed a gap: events stored locally are not synchronized with the cloud when the connection returns. Security was strengthened with an API key for the sensors and caregiver login with Supabase Auth (3/3 in production in both tests), and interoperability was completed with a pseudonymized FHIR Patient resource. Documenting the data model revealed mixed time zones and 1,463 alerts whose response was recorded in only one table; both were fixed with versioned migrations, measured before and after. The next steps are to implement store-and-forward synchronization, protect the read endpoints of the API and evaluate usability with caregivers in Phase 3.</w:t>
       </w:r>
     </w:p>
     <w:p>
@@ -5555,8 +5663,8 @@
     <w:p/>
     <w:sectPr>
       <w:headerReference w:type="default" r:id="rId11"/>
-      <w:headerReference w:type="first" r:id="rId31"/>
-      <w:footerReference w:type="default" r:id="rId32"/>
+      <w:headerReference w:type="first" r:id="rId32"/>
+      <w:footerReference w:type="default" r:id="rId33"/>
       <w:pgSz w:w="11906" w:h="16838"/>
       <w:pgMar w:top="1417" w:right="1701" w:bottom="1417" w:left="1701" w:header="708" w:footer="708" w:gutter="0"/>
       <w:cols w:space="708"/>

</xml_diff>